<commit_message>
editing and bug fixies
</commit_message>
<xml_diff>
--- a/Documents/Changelog.docx
+++ b/Documents/Changelog.docx
@@ -1,6 +1,6 @@
 
 <file path=word/document.xml><?xml version="1.0" encoding="utf-8"?>
-<w:document xmlns:wpc="http://schemas.microsoft.com/office/word/2010/wordprocessingCanvas" xmlns:cx="http://schemas.microsoft.com/office/drawing/2014/chartex" xmlns:cx1="http://schemas.microsoft.com/office/drawing/2015/9/8/chartex" xmlns:cx2="http://schemas.microsoft.com/office/drawing/2015/10/21/chartex" xmlns:cx3="http://schemas.microsoft.com/office/drawing/2016/5/9/chartex" xmlns:cx4="http://schemas.microsoft.com/office/drawing/2016/5/10/chartex" xmlns:cx5="http://schemas.microsoft.com/office/drawing/2016/5/11/chartex" xmlns:cx6="http://schemas.microsoft.com/office/drawing/2016/5/12/chartex" xmlns:cx7="http://schemas.microsoft.com/office/drawing/2016/5/13/chartex" xmlns:cx8="http://schemas.microsoft.com/office/drawing/2016/5/14/chartex" xmlns:mc="http://schemas.openxmlformats.org/markup-compatibility/2006" xmlns:aink="http://schemas.microsoft.com/office/drawing/2016/ink" xmlns:am3d="http://schemas.microsoft.com/office/drawing/2017/model3d" xmlns:o="urn:schemas-microsoft-com:office:office" xmlns:oel="http://schemas.microsoft.com/office/2019/extlst" xmlns:r="http://schemas.openxmlformats.org/officeDocument/2006/relationships" xmlns:m="http://schemas.openxmlformats.org/officeDocument/2006/math" xmlns:v="urn:schemas-microsoft-com:vml" xmlns:wp14="http://schemas.microsoft.com/office/word/2010/wordprocessingDrawing" xmlns:wp="http://schemas.openxmlformats.org/drawingml/2006/wordprocessingDrawing" xmlns:w10="urn:schemas-microsoft-com:office:word" xmlns:w="http://schemas.openxmlformats.org/wordprocessingml/2006/main" xmlns:w14="http://schemas.microsoft.com/office/word/2010/wordml" xmlns:w15="http://schemas.microsoft.com/office/word/2012/wordml" xmlns:w16cex="http://schemas.microsoft.com/office/word/2018/wordml/cex" xmlns:w16cid="http://schemas.microsoft.com/office/word/2016/wordml/cid" xmlns:w16="http://schemas.microsoft.com/office/word/2018/wordml" xmlns:w16du="http://schemas.microsoft.com/office/word/2023/wordml/word16du" xmlns:w16sdtdh="http://schemas.microsoft.com/office/word/2020/wordml/sdtdatahash" xmlns:w16sdtfl="http://schemas.microsoft.com/office/word/2024/wordml/sdtformatlock" xmlns:w16se="http://schemas.microsoft.com/office/word/2015/wordml/symex" xmlns:wpg="http://schemas.microsoft.com/office/word/2010/wordprocessingGroup" xmlns:wpi="http://schemas.microsoft.com/office/word/2010/wordprocessingInk" xmlns:wne="http://schemas.microsoft.com/office/word/2006/wordml" xmlns:wps="http://schemas.microsoft.com/office/word/2010/wordprocessingShape" xmlns:a="http://schemas.openxmlformats.org/drawingml/2006/main" mc:Ignorable="w14 w15 w16se w16cid w16 w16cex w16sdtdh w16sdtfl w16du wp14">
+<w:document xmlns:wpc="http://schemas.microsoft.com/office/word/2010/wordprocessingCanvas" xmlns:cx="http://schemas.microsoft.com/office/drawing/2014/chartex" xmlns:cx1="http://schemas.microsoft.com/office/drawing/2015/9/8/chartex" xmlns:cx2="http://schemas.microsoft.com/office/drawing/2015/10/21/chartex" xmlns:cx3="http://schemas.microsoft.com/office/drawing/2016/5/9/chartex" xmlns:cx4="http://schemas.microsoft.com/office/drawing/2016/5/10/chartex" xmlns:cx5="http://schemas.microsoft.com/office/drawing/2016/5/11/chartex" xmlns:cx6="http://schemas.microsoft.com/office/drawing/2016/5/12/chartex" xmlns:cx7="http://schemas.microsoft.com/office/drawing/2016/5/13/chartex" xmlns:cx8="http://schemas.microsoft.com/office/drawing/2016/5/14/chartex" xmlns:mc="http://schemas.openxmlformats.org/markup-compatibility/2006" xmlns:aink="http://schemas.microsoft.com/office/drawing/2016/ink" xmlns:am3d="http://schemas.microsoft.com/office/drawing/2017/model3d" xmlns:o="urn:schemas-microsoft-com:office:office" xmlns:oel="http://schemas.microsoft.com/office/2019/extlst" xmlns:r="http://schemas.openxmlformats.org/officeDocument/2006/relationships" xmlns:m="http://schemas.openxmlformats.org/officeDocument/2006/math" xmlns:v="urn:schemas-microsoft-com:vml" xmlns:wp14="http://schemas.microsoft.com/office/word/2010/wordprocessingDrawing" xmlns:wp="http://schemas.openxmlformats.org/drawingml/2006/wordprocessingDrawing" xmlns:w10="urn:schemas-microsoft-com:office:word" xmlns:w="http://schemas.openxmlformats.org/wordprocessingml/2006/main" xmlns:w14="http://schemas.microsoft.com/office/word/2010/wordml" xmlns:w15="http://schemas.microsoft.com/office/word/2012/wordml" xmlns:w16cex="http://schemas.microsoft.com/office/word/2018/wordml/cex" xmlns:w16cid="http://schemas.microsoft.com/office/word/2016/wordml/cid" xmlns:w16="http://schemas.microsoft.com/office/word/2018/wordml" xmlns:w16du="http://schemas.microsoft.com/office/word/2023/wordml/word16du" xmlns:w16sdtdh="http://schemas.microsoft.com/office/word/2020/wordml/sdtdatahash" xmlns:w16sdtfl="http://schemas.microsoft.com/office/word/2024/wordml/sdtformatlock" xmlns:w16se="http://schemas.microsoft.com/office/word/2015/wordml/symex" xmlns:wpg="http://schemas.microsoft.com/office/word/2010/wordprocessingGroup" xmlns:wpi="http://schemas.microsoft.com/office/word/2010/wordprocessingInk" xmlns:wne="http://schemas.microsoft.com/office/word/2006/wordml" xmlns:wps="http://schemas.microsoft.com/office/word/2010/wordprocessingShape" mc:Ignorable="w14 w15 w16se w16cid w16 w16cex w16sdtdh w16sdtfl w16du wp14">
   <w:body>
     <w:sdt>
       <w:sdtPr>
@@ -271,7 +271,7 @@
                   </wp:anchor>
                 </w:drawing>
               </mc:Choice>
-              <mc:Fallback>
+              <mc:Fallback xmlns:a="http://schemas.openxmlformats.org/drawingml/2006/main">
                 <w:pict>
                   <v:group id="Group 157" style="position:absolute;margin-left:0;margin-top:0;width:8in;height:95.7pt;z-index:251662336;mso-width-percent:941;mso-height-percent:121;mso-top-percent:23;mso-position-horizontal:center;mso-position-horizontal-relative:page;mso-position-vertical-relative:page;mso-width-percent:941;mso-height-percent:121;mso-top-percent:23" coordsize="73152,12161" coordorigin="" o:spid="_x0000_s1026" w14:anchorId="53B628AD" o:gfxdata="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">
                     <v:shape id="Rectangle 51" style="position:absolute;width:73152;height:11303;visibility:visible;mso-wrap-style:square;v-text-anchor:middle" coordsize="7312660,1129665" o:spid="_x0000_s1027" fillcolor="#156082 [3204]" stroked="f" strokeweight="1.5pt" path="m,l7312660,r,1129665l3619500,733425,,1091565,,xe" o:gfxdata="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">
@@ -441,7 +441,7 @@
                   </wp:anchor>
                 </w:drawing>
               </mc:Choice>
-              <mc:Fallback>
+              <mc:Fallback xmlns:a="http://schemas.openxmlformats.org/drawingml/2006/main">
                 <w:pict>
                   <v:shapetype id="_x0000_t202" coordsize="21600,21600" o:spt="202" path="m,l,21600r21600,l21600,xe" w14:anchorId="0ACF918D">
                     <v:stroke joinstyle="miter"/>
@@ -679,7 +679,7 @@
                   </wp:anchor>
                 </w:drawing>
               </mc:Choice>
-              <mc:Fallback>
+              <mc:Fallback xmlns:a="http://schemas.openxmlformats.org/drawingml/2006/main">
                 <w:pict>
                   <v:shape id="Text Box 161" style="position:absolute;margin-left:0;margin-top:0;width:8in;height:79.5pt;z-index:251661312;visibility:visible;mso-wrap-style:square;mso-width-percent:941;mso-height-percent:100;mso-top-percent:700;mso-wrap-distance-left:9pt;mso-wrap-distance-top:0;mso-wrap-distance-right:9pt;mso-wrap-distance-bottom:0;mso-position-horizontal:center;mso-position-horizontal-relative:page;mso-position-vertical-relative:page;mso-width-percent:941;mso-height-percent:100;mso-top-percent:700;mso-width-relative:page;mso-height-relative:page;v-text-anchor:top" o:spid="_x0000_s1027" filled="f" stroked="f" strokeweight=".5pt" type="#_x0000_t202" o:gfxdata="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" w14:anchorId="660F2046">
                     <v:textbox style="mso-fit-shape-to-text:t" inset="126pt,0,54pt,0">
@@ -930,7 +930,7 @@
                   </wp:anchor>
                 </w:drawing>
               </mc:Choice>
-              <mc:Fallback>
+              <mc:Fallback xmlns:a="http://schemas.openxmlformats.org/drawingml/2006/main">
                 <w:pict>
                   <v:shape id="Text Box 163" style="position:absolute;margin-left:0;margin-top:0;width:8in;height:286.5pt;z-index:251659264;visibility:visible;mso-wrap-style:square;mso-width-percent:941;mso-height-percent:363;mso-top-percent:300;mso-wrap-distance-left:9pt;mso-wrap-distance-top:0;mso-wrap-distance-right:9pt;mso-wrap-distance-bottom:0;mso-position-horizontal:center;mso-position-horizontal-relative:page;mso-position-vertical-relative:page;mso-width-percent:941;mso-height-percent:363;mso-top-percent:300;mso-width-relative:page;mso-height-relative:page;v-text-anchor:bottom" o:spid="_x0000_s1028" filled="f" stroked="f" strokeweight=".5pt" type="#_x0000_t202" o:gfxdata="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" w14:anchorId="1A9F0E54">
                     <v:textbox inset="126pt,0,54pt,0">
@@ -1071,7 +1071,6 @@
         <w:t>Changelog - Pabii's Retreat</w:t>
       </w:r>
     </w:p>
-    <w:p/>
     <w:p>
       <w:r>
         <w:t>10 July 2026 - Project Initialization &amp; Scope</w:t>
@@ -1427,36 +1426,29 @@
           <w:ilvl w:val="0"/>
           <w:numId w:val="6"/>
         </w:numPr>
-        <w:rPr/>
-      </w:pPr>
-      <w:r>
-        <w:rPr/>
+      </w:pPr>
+      <w:r>
         <w:t xml:space="preserve">Defined a </w:t>
       </w:r>
       <w:r>
-        <w:rPr/>
         <w:t>responsive breakpoint</w:t>
       </w:r>
       <w:r>
-        <w:rPr/>
         <w:t xml:space="preserve"> for different screen size</w:t>
       </w:r>
       <w:r>
-        <w:rPr/>
         <w:t>.</w:t>
       </w:r>
     </w:p>
-    <w:p/>
-    <w:p/>
     <w:sectPr>
       <w:footerReference w:type="default" r:id="rId10"/>
-      <w:pgSz w:w="11906" w:h="16838" w:orient="portrait"/>
+      <w:pgSz w:w="11906" w:h="16838"/>
       <w:pgMar w:top="1440" w:right="1440" w:bottom="1440" w:left="1440" w:header="708" w:footer="708" w:gutter="0"/>
       <w:pgBorders w:offsetFrom="page">
-        <w:top w:val="thinThickThinSmallGap" w:color="BF4E14" w:themeColor="accent2" w:themeShade="BF" w:sz="24" w:space="24"/>
-        <w:left w:val="thinThickThinSmallGap" w:color="BF4E14" w:themeColor="accent2" w:themeShade="BF" w:sz="24" w:space="24"/>
-        <w:bottom w:val="thinThickThinSmallGap" w:color="BF4E14" w:themeColor="accent2" w:themeShade="BF" w:sz="24" w:space="24"/>
-        <w:right w:val="thinThickThinSmallGap" w:color="BF4E14" w:themeColor="accent2" w:themeShade="BF" w:sz="24" w:space="24"/>
+        <w:top w:val="thinThickThinSmallGap" w:sz="24" w:space="24" w:color="BF4E14" w:themeColor="accent2" w:themeShade="BF"/>
+        <w:left w:val="thinThickThinSmallGap" w:sz="24" w:space="24" w:color="BF4E14" w:themeColor="accent2" w:themeShade="BF"/>
+        <w:bottom w:val="thinThickThinSmallGap" w:sz="24" w:space="24" w:color="BF4E14" w:themeColor="accent2" w:themeShade="BF"/>
+        <w:right w:val="thinThickThinSmallGap" w:sz="24" w:space="24" w:color="BF4E14" w:themeColor="accent2" w:themeShade="BF"/>
       </w:pgBorders>
       <w:pgNumType w:start="0"/>
       <w:cols w:space="708"/>
@@ -1585,7 +1577,7 @@
         <w:ind w:left="767" w:hanging="360"/>
       </w:pPr>
       <w:rPr>
-        <w:rFonts w:hint="default" w:ascii="Wingdings" w:hAnsi="Wingdings"/>
+        <w:rFonts w:ascii="Wingdings" w:hAnsi="Wingdings" w:hint="default"/>
       </w:rPr>
     </w:lvl>
     <w:lvl w:ilvl="1" w:tplc="1C090003" w:tentative="1">
@@ -1597,7 +1589,7 @@
         <w:ind w:left="1487" w:hanging="360"/>
       </w:pPr>
       <w:rPr>
-        <w:rFonts w:hint="default" w:ascii="Courier New" w:hAnsi="Courier New" w:cs="Courier New"/>
+        <w:rFonts w:ascii="Courier New" w:hAnsi="Courier New" w:cs="Courier New" w:hint="default"/>
       </w:rPr>
     </w:lvl>
     <w:lvl w:ilvl="2" w:tplc="1C090005" w:tentative="1">
@@ -1609,7 +1601,7 @@
         <w:ind w:left="2207" w:hanging="360"/>
       </w:pPr>
       <w:rPr>
-        <w:rFonts w:hint="default" w:ascii="Wingdings" w:hAnsi="Wingdings"/>
+        <w:rFonts w:ascii="Wingdings" w:hAnsi="Wingdings" w:hint="default"/>
       </w:rPr>
     </w:lvl>
     <w:lvl w:ilvl="3" w:tplc="1C090001" w:tentative="1">
@@ -1621,7 +1613,7 @@
         <w:ind w:left="2927" w:hanging="360"/>
       </w:pPr>
       <w:rPr>
-        <w:rFonts w:hint="default" w:ascii="Symbol" w:hAnsi="Symbol"/>
+        <w:rFonts w:ascii="Symbol" w:hAnsi="Symbol" w:hint="default"/>
       </w:rPr>
     </w:lvl>
     <w:lvl w:ilvl="4" w:tplc="1C090003" w:tentative="1">
@@ -1633,7 +1625,7 @@
         <w:ind w:left="3647" w:hanging="360"/>
       </w:pPr>
       <w:rPr>
-        <w:rFonts w:hint="default" w:ascii="Courier New" w:hAnsi="Courier New" w:cs="Courier New"/>
+        <w:rFonts w:ascii="Courier New" w:hAnsi="Courier New" w:cs="Courier New" w:hint="default"/>
       </w:rPr>
     </w:lvl>
     <w:lvl w:ilvl="5" w:tplc="1C090005" w:tentative="1">
@@ -1645,7 +1637,7 @@
         <w:ind w:left="4367" w:hanging="360"/>
       </w:pPr>
       <w:rPr>
-        <w:rFonts w:hint="default" w:ascii="Wingdings" w:hAnsi="Wingdings"/>
+        <w:rFonts w:ascii="Wingdings" w:hAnsi="Wingdings" w:hint="default"/>
       </w:rPr>
     </w:lvl>
     <w:lvl w:ilvl="6" w:tplc="1C090001" w:tentative="1">
@@ -1657,7 +1649,7 @@
         <w:ind w:left="5087" w:hanging="360"/>
       </w:pPr>
       <w:rPr>
-        <w:rFonts w:hint="default" w:ascii="Symbol" w:hAnsi="Symbol"/>
+        <w:rFonts w:ascii="Symbol" w:hAnsi="Symbol" w:hint="default"/>
       </w:rPr>
     </w:lvl>
     <w:lvl w:ilvl="7" w:tplc="1C090003" w:tentative="1">
@@ -1669,7 +1661,7 @@
         <w:ind w:left="5807" w:hanging="360"/>
       </w:pPr>
       <w:rPr>
-        <w:rFonts w:hint="default" w:ascii="Courier New" w:hAnsi="Courier New" w:cs="Courier New"/>
+        <w:rFonts w:ascii="Courier New" w:hAnsi="Courier New" w:cs="Courier New" w:hint="default"/>
       </w:rPr>
     </w:lvl>
     <w:lvl w:ilvl="8" w:tplc="1C090005" w:tentative="1">
@@ -1681,7 +1673,7 @@
         <w:ind w:left="6527" w:hanging="360"/>
       </w:pPr>
       <w:rPr>
-        <w:rFonts w:hint="default" w:ascii="Wingdings" w:hAnsi="Wingdings"/>
+        <w:rFonts w:ascii="Wingdings" w:hAnsi="Wingdings" w:hint="default"/>
       </w:rPr>
     </w:lvl>
   </w:abstractNum>
@@ -1698,7 +1690,7 @@
         <w:ind w:left="720" w:hanging="360"/>
       </w:pPr>
       <w:rPr>
-        <w:rFonts w:hint="default" w:ascii="Wingdings" w:hAnsi="Wingdings"/>
+        <w:rFonts w:ascii="Wingdings" w:hAnsi="Wingdings" w:hint="default"/>
       </w:rPr>
     </w:lvl>
     <w:lvl w:ilvl="1" w:tplc="1C090003" w:tentative="1">
@@ -1710,7 +1702,7 @@
         <w:ind w:left="1440" w:hanging="360"/>
       </w:pPr>
       <w:rPr>
-        <w:rFonts w:hint="default" w:ascii="Courier New" w:hAnsi="Courier New" w:cs="Courier New"/>
+        <w:rFonts w:ascii="Courier New" w:hAnsi="Courier New" w:cs="Courier New" w:hint="default"/>
       </w:rPr>
     </w:lvl>
     <w:lvl w:ilvl="2" w:tplc="1C090005" w:tentative="1">
@@ -1722,7 +1714,7 @@
         <w:ind w:left="2160" w:hanging="360"/>
       </w:pPr>
       <w:rPr>
-        <w:rFonts w:hint="default" w:ascii="Wingdings" w:hAnsi="Wingdings"/>
+        <w:rFonts w:ascii="Wingdings" w:hAnsi="Wingdings" w:hint="default"/>
       </w:rPr>
     </w:lvl>
     <w:lvl w:ilvl="3" w:tplc="1C090001" w:tentative="1">
@@ -1734,7 +1726,7 @@
         <w:ind w:left="2880" w:hanging="360"/>
       </w:pPr>
       <w:rPr>
-        <w:rFonts w:hint="default" w:ascii="Symbol" w:hAnsi="Symbol"/>
+        <w:rFonts w:ascii="Symbol" w:hAnsi="Symbol" w:hint="default"/>
       </w:rPr>
     </w:lvl>
     <w:lvl w:ilvl="4" w:tplc="1C090003" w:tentative="1">
@@ -1746,7 +1738,7 @@
         <w:ind w:left="3600" w:hanging="360"/>
       </w:pPr>
       <w:rPr>
-        <w:rFonts w:hint="default" w:ascii="Courier New" w:hAnsi="Courier New" w:cs="Courier New"/>
+        <w:rFonts w:ascii="Courier New" w:hAnsi="Courier New" w:cs="Courier New" w:hint="default"/>
       </w:rPr>
     </w:lvl>
     <w:lvl w:ilvl="5" w:tplc="1C090005" w:tentative="1">
@@ -1758,7 +1750,7 @@
         <w:ind w:left="4320" w:hanging="360"/>
       </w:pPr>
       <w:rPr>
-        <w:rFonts w:hint="default" w:ascii="Wingdings" w:hAnsi="Wingdings"/>
+        <w:rFonts w:ascii="Wingdings" w:hAnsi="Wingdings" w:hint="default"/>
       </w:rPr>
     </w:lvl>
     <w:lvl w:ilvl="6" w:tplc="1C090001" w:tentative="1">
@@ -1770,7 +1762,7 @@
         <w:ind w:left="5040" w:hanging="360"/>
       </w:pPr>
       <w:rPr>
-        <w:rFonts w:hint="default" w:ascii="Symbol" w:hAnsi="Symbol"/>
+        <w:rFonts w:ascii="Symbol" w:hAnsi="Symbol" w:hint="default"/>
       </w:rPr>
     </w:lvl>
     <w:lvl w:ilvl="7" w:tplc="1C090003" w:tentative="1">
@@ -1782,7 +1774,7 @@
         <w:ind w:left="5760" w:hanging="360"/>
       </w:pPr>
       <w:rPr>
-        <w:rFonts w:hint="default" w:ascii="Courier New" w:hAnsi="Courier New" w:cs="Courier New"/>
+        <w:rFonts w:ascii="Courier New" w:hAnsi="Courier New" w:cs="Courier New" w:hint="default"/>
       </w:rPr>
     </w:lvl>
     <w:lvl w:ilvl="8" w:tplc="1C090005" w:tentative="1">
@@ -1794,7 +1786,7 @@
         <w:ind w:left="6480" w:hanging="360"/>
       </w:pPr>
       <w:rPr>
-        <w:rFonts w:hint="default" w:ascii="Wingdings" w:hAnsi="Wingdings"/>
+        <w:rFonts w:ascii="Wingdings" w:hAnsi="Wingdings" w:hint="default"/>
       </w:rPr>
     </w:lvl>
   </w:abstractNum>
@@ -1811,7 +1803,7 @@
         <w:ind w:left="720" w:hanging="360"/>
       </w:pPr>
       <w:rPr>
-        <w:rFonts w:hint="default" w:ascii="Wingdings" w:hAnsi="Wingdings"/>
+        <w:rFonts w:ascii="Wingdings" w:hAnsi="Wingdings" w:hint="default"/>
       </w:rPr>
     </w:lvl>
     <w:lvl w:ilvl="1" w:tplc="1C090003" w:tentative="1">
@@ -1823,7 +1815,7 @@
         <w:ind w:left="1440" w:hanging="360"/>
       </w:pPr>
       <w:rPr>
-        <w:rFonts w:hint="default" w:ascii="Courier New" w:hAnsi="Courier New" w:cs="Courier New"/>
+        <w:rFonts w:ascii="Courier New" w:hAnsi="Courier New" w:cs="Courier New" w:hint="default"/>
       </w:rPr>
     </w:lvl>
     <w:lvl w:ilvl="2" w:tplc="1C090005" w:tentative="1">
@@ -1835,7 +1827,7 @@
         <w:ind w:left="2160" w:hanging="360"/>
       </w:pPr>
       <w:rPr>
-        <w:rFonts w:hint="default" w:ascii="Wingdings" w:hAnsi="Wingdings"/>
+        <w:rFonts w:ascii="Wingdings" w:hAnsi="Wingdings" w:hint="default"/>
       </w:rPr>
     </w:lvl>
     <w:lvl w:ilvl="3" w:tplc="1C090001" w:tentative="1">
@@ -1847,7 +1839,7 @@
         <w:ind w:left="2880" w:hanging="360"/>
       </w:pPr>
       <w:rPr>
-        <w:rFonts w:hint="default" w:ascii="Symbol" w:hAnsi="Symbol"/>
+        <w:rFonts w:ascii="Symbol" w:hAnsi="Symbol" w:hint="default"/>
       </w:rPr>
     </w:lvl>
     <w:lvl w:ilvl="4" w:tplc="1C090003" w:tentative="1">
@@ -1859,7 +1851,7 @@
         <w:ind w:left="3600" w:hanging="360"/>
       </w:pPr>
       <w:rPr>
-        <w:rFonts w:hint="default" w:ascii="Courier New" w:hAnsi="Courier New" w:cs="Courier New"/>
+        <w:rFonts w:ascii="Courier New" w:hAnsi="Courier New" w:cs="Courier New" w:hint="default"/>
       </w:rPr>
     </w:lvl>
     <w:lvl w:ilvl="5" w:tplc="1C090005" w:tentative="1">
@@ -1871,7 +1863,7 @@
         <w:ind w:left="4320" w:hanging="360"/>
       </w:pPr>
       <w:rPr>
-        <w:rFonts w:hint="default" w:ascii="Wingdings" w:hAnsi="Wingdings"/>
+        <w:rFonts w:ascii="Wingdings" w:hAnsi="Wingdings" w:hint="default"/>
       </w:rPr>
     </w:lvl>
     <w:lvl w:ilvl="6" w:tplc="1C090001" w:tentative="1">
@@ -1883,7 +1875,7 @@
         <w:ind w:left="5040" w:hanging="360"/>
       </w:pPr>
       <w:rPr>
-        <w:rFonts w:hint="default" w:ascii="Symbol" w:hAnsi="Symbol"/>
+        <w:rFonts w:ascii="Symbol" w:hAnsi="Symbol" w:hint="default"/>
       </w:rPr>
     </w:lvl>
     <w:lvl w:ilvl="7" w:tplc="1C090003" w:tentative="1">
@@ -1895,7 +1887,7 @@
         <w:ind w:left="5760" w:hanging="360"/>
       </w:pPr>
       <w:rPr>
-        <w:rFonts w:hint="default" w:ascii="Courier New" w:hAnsi="Courier New" w:cs="Courier New"/>
+        <w:rFonts w:ascii="Courier New" w:hAnsi="Courier New" w:cs="Courier New" w:hint="default"/>
       </w:rPr>
     </w:lvl>
     <w:lvl w:ilvl="8" w:tplc="1C090005" w:tentative="1">
@@ -1907,7 +1899,7 @@
         <w:ind w:left="6480" w:hanging="360"/>
       </w:pPr>
       <w:rPr>
-        <w:rFonts w:hint="default" w:ascii="Wingdings" w:hAnsi="Wingdings"/>
+        <w:rFonts w:ascii="Wingdings" w:hAnsi="Wingdings" w:hint="default"/>
       </w:rPr>
     </w:lvl>
   </w:abstractNum>
@@ -1924,7 +1916,7 @@
         <w:ind w:left="720" w:hanging="360"/>
       </w:pPr>
       <w:rPr>
-        <w:rFonts w:hint="default" w:ascii="Wingdings" w:hAnsi="Wingdings"/>
+        <w:rFonts w:ascii="Wingdings" w:hAnsi="Wingdings" w:hint="default"/>
       </w:rPr>
     </w:lvl>
     <w:lvl w:ilvl="1" w:tplc="1C090003" w:tentative="1">
@@ -1936,7 +1928,7 @@
         <w:ind w:left="1440" w:hanging="360"/>
       </w:pPr>
       <w:rPr>
-        <w:rFonts w:hint="default" w:ascii="Courier New" w:hAnsi="Courier New" w:cs="Courier New"/>
+        <w:rFonts w:ascii="Courier New" w:hAnsi="Courier New" w:cs="Courier New" w:hint="default"/>
       </w:rPr>
     </w:lvl>
     <w:lvl w:ilvl="2" w:tplc="1C090005" w:tentative="1">
@@ -1948,7 +1940,7 @@
         <w:ind w:left="2160" w:hanging="360"/>
       </w:pPr>
       <w:rPr>
-        <w:rFonts w:hint="default" w:ascii="Wingdings" w:hAnsi="Wingdings"/>
+        <w:rFonts w:ascii="Wingdings" w:hAnsi="Wingdings" w:hint="default"/>
       </w:rPr>
     </w:lvl>
     <w:lvl w:ilvl="3" w:tplc="1C090001" w:tentative="1">
@@ -1960,7 +1952,7 @@
         <w:ind w:left="2880" w:hanging="360"/>
       </w:pPr>
       <w:rPr>
-        <w:rFonts w:hint="default" w:ascii="Symbol" w:hAnsi="Symbol"/>
+        <w:rFonts w:ascii="Symbol" w:hAnsi="Symbol" w:hint="default"/>
       </w:rPr>
     </w:lvl>
     <w:lvl w:ilvl="4" w:tplc="1C090003" w:tentative="1">
@@ -1972,7 +1964,7 @@
         <w:ind w:left="3600" w:hanging="360"/>
       </w:pPr>
       <w:rPr>
-        <w:rFonts w:hint="default" w:ascii="Courier New" w:hAnsi="Courier New" w:cs="Courier New"/>
+        <w:rFonts w:ascii="Courier New" w:hAnsi="Courier New" w:cs="Courier New" w:hint="default"/>
       </w:rPr>
     </w:lvl>
     <w:lvl w:ilvl="5" w:tplc="1C090005" w:tentative="1">
@@ -1984,7 +1976,7 @@
         <w:ind w:left="4320" w:hanging="360"/>
       </w:pPr>
       <w:rPr>
-        <w:rFonts w:hint="default" w:ascii="Wingdings" w:hAnsi="Wingdings"/>
+        <w:rFonts w:ascii="Wingdings" w:hAnsi="Wingdings" w:hint="default"/>
       </w:rPr>
     </w:lvl>
     <w:lvl w:ilvl="6" w:tplc="1C090001" w:tentative="1">
@@ -1996,7 +1988,7 @@
         <w:ind w:left="5040" w:hanging="360"/>
       </w:pPr>
       <w:rPr>
-        <w:rFonts w:hint="default" w:ascii="Symbol" w:hAnsi="Symbol"/>
+        <w:rFonts w:ascii="Symbol" w:hAnsi="Symbol" w:hint="default"/>
       </w:rPr>
     </w:lvl>
     <w:lvl w:ilvl="7" w:tplc="1C090003" w:tentative="1">
@@ -2008,7 +2000,7 @@
         <w:ind w:left="5760" w:hanging="360"/>
       </w:pPr>
       <w:rPr>
-        <w:rFonts w:hint="default" w:ascii="Courier New" w:hAnsi="Courier New" w:cs="Courier New"/>
+        <w:rFonts w:ascii="Courier New" w:hAnsi="Courier New" w:cs="Courier New" w:hint="default"/>
       </w:rPr>
     </w:lvl>
     <w:lvl w:ilvl="8" w:tplc="1C090005" w:tentative="1">
@@ -2020,7 +2012,7 @@
         <w:ind w:left="6480" w:hanging="360"/>
       </w:pPr>
       <w:rPr>
-        <w:rFonts w:hint="default" w:ascii="Wingdings" w:hAnsi="Wingdings"/>
+        <w:rFonts w:ascii="Wingdings" w:hAnsi="Wingdings" w:hint="default"/>
       </w:rPr>
     </w:lvl>
   </w:abstractNum>
@@ -2037,7 +2029,7 @@
         <w:ind w:left="720" w:hanging="360"/>
       </w:pPr>
       <w:rPr>
-        <w:rFonts w:hint="default" w:ascii="Wingdings" w:hAnsi="Wingdings"/>
+        <w:rFonts w:ascii="Wingdings" w:hAnsi="Wingdings" w:hint="default"/>
       </w:rPr>
     </w:lvl>
     <w:lvl w:ilvl="1" w:tplc="1C090003" w:tentative="1">
@@ -2049,7 +2041,7 @@
         <w:ind w:left="1440" w:hanging="360"/>
       </w:pPr>
       <w:rPr>
-        <w:rFonts w:hint="default" w:ascii="Courier New" w:hAnsi="Courier New" w:cs="Courier New"/>
+        <w:rFonts w:ascii="Courier New" w:hAnsi="Courier New" w:cs="Courier New" w:hint="default"/>
       </w:rPr>
     </w:lvl>
     <w:lvl w:ilvl="2" w:tplc="1C090005" w:tentative="1">
@@ -2061,7 +2053,7 @@
         <w:ind w:left="2160" w:hanging="360"/>
       </w:pPr>
       <w:rPr>
-        <w:rFonts w:hint="default" w:ascii="Wingdings" w:hAnsi="Wingdings"/>
+        <w:rFonts w:ascii="Wingdings" w:hAnsi="Wingdings" w:hint="default"/>
       </w:rPr>
     </w:lvl>
     <w:lvl w:ilvl="3" w:tplc="1C090001" w:tentative="1">
@@ -2073,7 +2065,7 @@
         <w:ind w:left="2880" w:hanging="360"/>
       </w:pPr>
       <w:rPr>
-        <w:rFonts w:hint="default" w:ascii="Symbol" w:hAnsi="Symbol"/>
+        <w:rFonts w:ascii="Symbol" w:hAnsi="Symbol" w:hint="default"/>
       </w:rPr>
     </w:lvl>
     <w:lvl w:ilvl="4" w:tplc="1C090003" w:tentative="1">
@@ -2085,7 +2077,7 @@
         <w:ind w:left="3600" w:hanging="360"/>
       </w:pPr>
       <w:rPr>
-        <w:rFonts w:hint="default" w:ascii="Courier New" w:hAnsi="Courier New" w:cs="Courier New"/>
+        <w:rFonts w:ascii="Courier New" w:hAnsi="Courier New" w:cs="Courier New" w:hint="default"/>
       </w:rPr>
     </w:lvl>
     <w:lvl w:ilvl="5" w:tplc="1C090005" w:tentative="1">
@@ -2097,7 +2089,7 @@
         <w:ind w:left="4320" w:hanging="360"/>
       </w:pPr>
       <w:rPr>
-        <w:rFonts w:hint="default" w:ascii="Wingdings" w:hAnsi="Wingdings"/>
+        <w:rFonts w:ascii="Wingdings" w:hAnsi="Wingdings" w:hint="default"/>
       </w:rPr>
     </w:lvl>
     <w:lvl w:ilvl="6" w:tplc="1C090001" w:tentative="1">
@@ -2109,7 +2101,7 @@
         <w:ind w:left="5040" w:hanging="360"/>
       </w:pPr>
       <w:rPr>
-        <w:rFonts w:hint="default" w:ascii="Symbol" w:hAnsi="Symbol"/>
+        <w:rFonts w:ascii="Symbol" w:hAnsi="Symbol" w:hint="default"/>
       </w:rPr>
     </w:lvl>
     <w:lvl w:ilvl="7" w:tplc="1C090003" w:tentative="1">
@@ -2121,7 +2113,7 @@
         <w:ind w:left="5760" w:hanging="360"/>
       </w:pPr>
       <w:rPr>
-        <w:rFonts w:hint="default" w:ascii="Courier New" w:hAnsi="Courier New" w:cs="Courier New"/>
+        <w:rFonts w:ascii="Courier New" w:hAnsi="Courier New" w:cs="Courier New" w:hint="default"/>
       </w:rPr>
     </w:lvl>
     <w:lvl w:ilvl="8" w:tplc="1C090005" w:tentative="1">
@@ -2133,7 +2125,7 @@
         <w:ind w:left="6480" w:hanging="360"/>
       </w:pPr>
       <w:rPr>
-        <w:rFonts w:hint="default" w:ascii="Wingdings" w:hAnsi="Wingdings"/>
+        <w:rFonts w:ascii="Wingdings" w:hAnsi="Wingdings" w:hint="default"/>
       </w:rPr>
     </w:lvl>
   </w:abstractNum>
@@ -2150,7 +2142,7 @@
         <w:ind w:left="767" w:hanging="360"/>
       </w:pPr>
       <w:rPr>
-        <w:rFonts w:hint="default" w:ascii="Wingdings" w:hAnsi="Wingdings"/>
+        <w:rFonts w:ascii="Wingdings" w:hAnsi="Wingdings" w:hint="default"/>
       </w:rPr>
     </w:lvl>
     <w:lvl w:ilvl="1" w:tplc="1C090003" w:tentative="1">
@@ -2162,7 +2154,7 @@
         <w:ind w:left="1487" w:hanging="360"/>
       </w:pPr>
       <w:rPr>
-        <w:rFonts w:hint="default" w:ascii="Courier New" w:hAnsi="Courier New" w:cs="Courier New"/>
+        <w:rFonts w:ascii="Courier New" w:hAnsi="Courier New" w:cs="Courier New" w:hint="default"/>
       </w:rPr>
     </w:lvl>
     <w:lvl w:ilvl="2" w:tplc="1C090005" w:tentative="1">
@@ -2174,7 +2166,7 @@
         <w:ind w:left="2207" w:hanging="360"/>
       </w:pPr>
       <w:rPr>
-        <w:rFonts w:hint="default" w:ascii="Wingdings" w:hAnsi="Wingdings"/>
+        <w:rFonts w:ascii="Wingdings" w:hAnsi="Wingdings" w:hint="default"/>
       </w:rPr>
     </w:lvl>
     <w:lvl w:ilvl="3" w:tplc="1C090001" w:tentative="1">
@@ -2186,7 +2178,7 @@
         <w:ind w:left="2927" w:hanging="360"/>
       </w:pPr>
       <w:rPr>
-        <w:rFonts w:hint="default" w:ascii="Symbol" w:hAnsi="Symbol"/>
+        <w:rFonts w:ascii="Symbol" w:hAnsi="Symbol" w:hint="default"/>
       </w:rPr>
     </w:lvl>
     <w:lvl w:ilvl="4" w:tplc="1C090003" w:tentative="1">
@@ -2198,7 +2190,7 @@
         <w:ind w:left="3647" w:hanging="360"/>
       </w:pPr>
       <w:rPr>
-        <w:rFonts w:hint="default" w:ascii="Courier New" w:hAnsi="Courier New" w:cs="Courier New"/>
+        <w:rFonts w:ascii="Courier New" w:hAnsi="Courier New" w:cs="Courier New" w:hint="default"/>
       </w:rPr>
     </w:lvl>
     <w:lvl w:ilvl="5" w:tplc="1C090005" w:tentative="1">
@@ -2210,7 +2202,7 @@
         <w:ind w:left="4367" w:hanging="360"/>
       </w:pPr>
       <w:rPr>
-        <w:rFonts w:hint="default" w:ascii="Wingdings" w:hAnsi="Wingdings"/>
+        <w:rFonts w:ascii="Wingdings" w:hAnsi="Wingdings" w:hint="default"/>
       </w:rPr>
     </w:lvl>
     <w:lvl w:ilvl="6" w:tplc="1C090001" w:tentative="1">
@@ -2222,7 +2214,7 @@
         <w:ind w:left="5087" w:hanging="360"/>
       </w:pPr>
       <w:rPr>
-        <w:rFonts w:hint="default" w:ascii="Symbol" w:hAnsi="Symbol"/>
+        <w:rFonts w:ascii="Symbol" w:hAnsi="Symbol" w:hint="default"/>
       </w:rPr>
     </w:lvl>
     <w:lvl w:ilvl="7" w:tplc="1C090003" w:tentative="1">
@@ -2234,7 +2226,7 @@
         <w:ind w:left="5807" w:hanging="360"/>
       </w:pPr>
       <w:rPr>
-        <w:rFonts w:hint="default" w:ascii="Courier New" w:hAnsi="Courier New" w:cs="Courier New"/>
+        <w:rFonts w:ascii="Courier New" w:hAnsi="Courier New" w:cs="Courier New" w:hint="default"/>
       </w:rPr>
     </w:lvl>
     <w:lvl w:ilvl="8" w:tplc="1C090005" w:tentative="1">
@@ -2246,7 +2238,7 @@
         <w:ind w:left="6527" w:hanging="360"/>
       </w:pPr>
       <w:rPr>
-        <w:rFonts w:hint="default" w:ascii="Wingdings" w:hAnsi="Wingdings"/>
+        <w:rFonts w:ascii="Wingdings" w:hAnsi="Wingdings" w:hint="default"/>
       </w:rPr>
     </w:lvl>
   </w:abstractNum>
@@ -2263,7 +2255,7 @@
         <w:ind w:left="720" w:hanging="360"/>
       </w:pPr>
       <w:rPr>
-        <w:rFonts w:hint="default" w:ascii="Wingdings" w:hAnsi="Wingdings"/>
+        <w:rFonts w:ascii="Wingdings" w:hAnsi="Wingdings" w:hint="default"/>
       </w:rPr>
     </w:lvl>
     <w:lvl w:ilvl="1" w:tplc="1C090003" w:tentative="1">
@@ -2275,7 +2267,7 @@
         <w:ind w:left="1440" w:hanging="360"/>
       </w:pPr>
       <w:rPr>
-        <w:rFonts w:hint="default" w:ascii="Courier New" w:hAnsi="Courier New" w:cs="Courier New"/>
+        <w:rFonts w:ascii="Courier New" w:hAnsi="Courier New" w:cs="Courier New" w:hint="default"/>
       </w:rPr>
     </w:lvl>
     <w:lvl w:ilvl="2" w:tplc="1C090005" w:tentative="1">
@@ -2287,7 +2279,7 @@
         <w:ind w:left="2160" w:hanging="360"/>
       </w:pPr>
       <w:rPr>
-        <w:rFonts w:hint="default" w:ascii="Wingdings" w:hAnsi="Wingdings"/>
+        <w:rFonts w:ascii="Wingdings" w:hAnsi="Wingdings" w:hint="default"/>
       </w:rPr>
     </w:lvl>
     <w:lvl w:ilvl="3" w:tplc="1C090001" w:tentative="1">
@@ -2299,7 +2291,7 @@
         <w:ind w:left="2880" w:hanging="360"/>
       </w:pPr>
       <w:rPr>
-        <w:rFonts w:hint="default" w:ascii="Symbol" w:hAnsi="Symbol"/>
+        <w:rFonts w:ascii="Symbol" w:hAnsi="Symbol" w:hint="default"/>
       </w:rPr>
     </w:lvl>
     <w:lvl w:ilvl="4" w:tplc="1C090003" w:tentative="1">
@@ -2311,7 +2303,7 @@
         <w:ind w:left="3600" w:hanging="360"/>
       </w:pPr>
       <w:rPr>
-        <w:rFonts w:hint="default" w:ascii="Courier New" w:hAnsi="Courier New" w:cs="Courier New"/>
+        <w:rFonts w:ascii="Courier New" w:hAnsi="Courier New" w:cs="Courier New" w:hint="default"/>
       </w:rPr>
     </w:lvl>
     <w:lvl w:ilvl="5" w:tplc="1C090005" w:tentative="1">
@@ -2323,7 +2315,7 @@
         <w:ind w:left="4320" w:hanging="360"/>
       </w:pPr>
       <w:rPr>
-        <w:rFonts w:hint="default" w:ascii="Wingdings" w:hAnsi="Wingdings"/>
+        <w:rFonts w:ascii="Wingdings" w:hAnsi="Wingdings" w:hint="default"/>
       </w:rPr>
     </w:lvl>
     <w:lvl w:ilvl="6" w:tplc="1C090001" w:tentative="1">
@@ -2335,7 +2327,7 @@
         <w:ind w:left="5040" w:hanging="360"/>
       </w:pPr>
       <w:rPr>
-        <w:rFonts w:hint="default" w:ascii="Symbol" w:hAnsi="Symbol"/>
+        <w:rFonts w:ascii="Symbol" w:hAnsi="Symbol" w:hint="default"/>
       </w:rPr>
     </w:lvl>
     <w:lvl w:ilvl="7" w:tplc="1C090003" w:tentative="1">
@@ -2347,7 +2339,7 @@
         <w:ind w:left="5760" w:hanging="360"/>
       </w:pPr>
       <w:rPr>
-        <w:rFonts w:hint="default" w:ascii="Courier New" w:hAnsi="Courier New" w:cs="Courier New"/>
+        <w:rFonts w:ascii="Courier New" w:hAnsi="Courier New" w:cs="Courier New" w:hint="default"/>
       </w:rPr>
     </w:lvl>
     <w:lvl w:ilvl="8" w:tplc="1C090005" w:tentative="1">
@@ -2359,7 +2351,7 @@
         <w:ind w:left="6480" w:hanging="360"/>
       </w:pPr>
       <w:rPr>
-        <w:rFonts w:hint="default" w:ascii="Wingdings" w:hAnsi="Wingdings"/>
+        <w:rFonts w:ascii="Wingdings" w:hAnsi="Wingdings" w:hint="default"/>
       </w:rPr>
     </w:lvl>
   </w:abstractNum>
@@ -2376,7 +2368,7 @@
         <w:ind w:left="720" w:hanging="360"/>
       </w:pPr>
       <w:rPr>
-        <w:rFonts w:hint="default" w:ascii="Wingdings" w:hAnsi="Wingdings"/>
+        <w:rFonts w:ascii="Wingdings" w:hAnsi="Wingdings" w:hint="default"/>
       </w:rPr>
     </w:lvl>
     <w:lvl w:ilvl="1" w:tplc="1C090003" w:tentative="1">
@@ -2388,7 +2380,7 @@
         <w:ind w:left="1440" w:hanging="360"/>
       </w:pPr>
       <w:rPr>
-        <w:rFonts w:hint="default" w:ascii="Courier New" w:hAnsi="Courier New" w:cs="Courier New"/>
+        <w:rFonts w:ascii="Courier New" w:hAnsi="Courier New" w:cs="Courier New" w:hint="default"/>
       </w:rPr>
     </w:lvl>
     <w:lvl w:ilvl="2" w:tplc="1C090005" w:tentative="1">
@@ -2400,7 +2392,7 @@
         <w:ind w:left="2160" w:hanging="360"/>
       </w:pPr>
       <w:rPr>
-        <w:rFonts w:hint="default" w:ascii="Wingdings" w:hAnsi="Wingdings"/>
+        <w:rFonts w:ascii="Wingdings" w:hAnsi="Wingdings" w:hint="default"/>
       </w:rPr>
     </w:lvl>
     <w:lvl w:ilvl="3" w:tplc="1C090001" w:tentative="1">
@@ -2412,7 +2404,7 @@
         <w:ind w:left="2880" w:hanging="360"/>
       </w:pPr>
       <w:rPr>
-        <w:rFonts w:hint="default" w:ascii="Symbol" w:hAnsi="Symbol"/>
+        <w:rFonts w:ascii="Symbol" w:hAnsi="Symbol" w:hint="default"/>
       </w:rPr>
     </w:lvl>
     <w:lvl w:ilvl="4" w:tplc="1C090003" w:tentative="1">
@@ -2424,7 +2416,7 @@
         <w:ind w:left="3600" w:hanging="360"/>
       </w:pPr>
       <w:rPr>
-        <w:rFonts w:hint="default" w:ascii="Courier New" w:hAnsi="Courier New" w:cs="Courier New"/>
+        <w:rFonts w:ascii="Courier New" w:hAnsi="Courier New" w:cs="Courier New" w:hint="default"/>
       </w:rPr>
     </w:lvl>
     <w:lvl w:ilvl="5" w:tplc="1C090005" w:tentative="1">
@@ -2436,7 +2428,7 @@
         <w:ind w:left="4320" w:hanging="360"/>
       </w:pPr>
       <w:rPr>
-        <w:rFonts w:hint="default" w:ascii="Wingdings" w:hAnsi="Wingdings"/>
+        <w:rFonts w:ascii="Wingdings" w:hAnsi="Wingdings" w:hint="default"/>
       </w:rPr>
     </w:lvl>
     <w:lvl w:ilvl="6" w:tplc="1C090001" w:tentative="1">
@@ -2448,7 +2440,7 @@
         <w:ind w:left="5040" w:hanging="360"/>
       </w:pPr>
       <w:rPr>
-        <w:rFonts w:hint="default" w:ascii="Symbol" w:hAnsi="Symbol"/>
+        <w:rFonts w:ascii="Symbol" w:hAnsi="Symbol" w:hint="default"/>
       </w:rPr>
     </w:lvl>
     <w:lvl w:ilvl="7" w:tplc="1C090003" w:tentative="1">
@@ -2460,7 +2452,7 @@
         <w:ind w:left="5760" w:hanging="360"/>
       </w:pPr>
       <w:rPr>
-        <w:rFonts w:hint="default" w:ascii="Courier New" w:hAnsi="Courier New" w:cs="Courier New"/>
+        <w:rFonts w:ascii="Courier New" w:hAnsi="Courier New" w:cs="Courier New" w:hint="default"/>
       </w:rPr>
     </w:lvl>
     <w:lvl w:ilvl="8" w:tplc="1C090005" w:tentative="1">
@@ -2472,7 +2464,7 @@
         <w:ind w:left="6480" w:hanging="360"/>
       </w:pPr>
       <w:rPr>
-        <w:rFonts w:hint="default" w:ascii="Wingdings" w:hAnsi="Wingdings"/>
+        <w:rFonts w:ascii="Wingdings" w:hAnsi="Wingdings" w:hint="default"/>
       </w:rPr>
     </w:lvl>
   </w:abstractNum>
@@ -2508,7 +2500,7 @@
   <w:docDefaults>
     <w:rPrDefault>
       <w:rPr>
-        <w:rFonts w:asciiTheme="minorHAnsi" w:hAnsiTheme="minorHAnsi" w:eastAsiaTheme="minorHAnsi" w:cstheme="minorBidi"/>
+        <w:rFonts w:asciiTheme="minorHAnsi" w:eastAsiaTheme="minorHAnsi" w:hAnsiTheme="minorHAnsi" w:cstheme="minorBidi"/>
         <w:kern w:val="2"/>
         <w:sz w:val="24"/>
         <w:szCs w:val="24"/>
@@ -2525,14 +2517,14 @@
   <w:latentStyles w:defLockedState="0" w:defUIPriority="99" w:defSemiHidden="0" w:defUnhideWhenUsed="0" w:defQFormat="0" w:count="376">
     <w:lsdException w:name="Normal" w:uiPriority="0" w:qFormat="1"/>
     <w:lsdException w:name="heading 1" w:uiPriority="9" w:qFormat="1"/>
-    <w:lsdException w:name="heading 2" w:uiPriority="9" w:semiHidden="1" w:unhideWhenUsed="1" w:qFormat="1"/>
-    <w:lsdException w:name="heading 3" w:uiPriority="9" w:semiHidden="1" w:unhideWhenUsed="1" w:qFormat="1"/>
-    <w:lsdException w:name="heading 4" w:uiPriority="9" w:semiHidden="1" w:unhideWhenUsed="1" w:qFormat="1"/>
-    <w:lsdException w:name="heading 5" w:uiPriority="9" w:semiHidden="1" w:unhideWhenUsed="1" w:qFormat="1"/>
-    <w:lsdException w:name="heading 6" w:uiPriority="9" w:semiHidden="1" w:unhideWhenUsed="1" w:qFormat="1"/>
-    <w:lsdException w:name="heading 7" w:uiPriority="9" w:semiHidden="1" w:unhideWhenUsed="1" w:qFormat="1"/>
-    <w:lsdException w:name="heading 8" w:uiPriority="9" w:semiHidden="1" w:unhideWhenUsed="1" w:qFormat="1"/>
-    <w:lsdException w:name="heading 9" w:uiPriority="9" w:semiHidden="1" w:unhideWhenUsed="1" w:qFormat="1"/>
+    <w:lsdException w:name="heading 2" w:semiHidden="1" w:uiPriority="9" w:unhideWhenUsed="1" w:qFormat="1"/>
+    <w:lsdException w:name="heading 3" w:semiHidden="1" w:uiPriority="9" w:unhideWhenUsed="1" w:qFormat="1"/>
+    <w:lsdException w:name="heading 4" w:semiHidden="1" w:uiPriority="9" w:unhideWhenUsed="1" w:qFormat="1"/>
+    <w:lsdException w:name="heading 5" w:semiHidden="1" w:uiPriority="9" w:unhideWhenUsed="1" w:qFormat="1"/>
+    <w:lsdException w:name="heading 6" w:semiHidden="1" w:uiPriority="9" w:unhideWhenUsed="1" w:qFormat="1"/>
+    <w:lsdException w:name="heading 7" w:semiHidden="1" w:uiPriority="9" w:unhideWhenUsed="1" w:qFormat="1"/>
+    <w:lsdException w:name="heading 8" w:semiHidden="1" w:uiPriority="9" w:unhideWhenUsed="1" w:qFormat="1"/>
+    <w:lsdException w:name="heading 9" w:semiHidden="1" w:uiPriority="9" w:unhideWhenUsed="1" w:qFormat="1"/>
     <w:lsdException w:name="index 1" w:semiHidden="1" w:unhideWhenUsed="1"/>
     <w:lsdException w:name="index 2" w:semiHidden="1" w:unhideWhenUsed="1"/>
     <w:lsdException w:name="index 3" w:semiHidden="1" w:unhideWhenUsed="1"/>
@@ -2542,22 +2534,22 @@
     <w:lsdException w:name="index 7" w:semiHidden="1" w:unhideWhenUsed="1"/>
     <w:lsdException w:name="index 8" w:semiHidden="1" w:unhideWhenUsed="1"/>
     <w:lsdException w:name="index 9" w:semiHidden="1" w:unhideWhenUsed="1"/>
-    <w:lsdException w:name="toc 1" w:uiPriority="39" w:semiHidden="1" w:unhideWhenUsed="1"/>
-    <w:lsdException w:name="toc 2" w:uiPriority="39" w:semiHidden="1" w:unhideWhenUsed="1"/>
-    <w:lsdException w:name="toc 3" w:uiPriority="39" w:semiHidden="1" w:unhideWhenUsed="1"/>
-    <w:lsdException w:name="toc 4" w:uiPriority="39" w:semiHidden="1" w:unhideWhenUsed="1"/>
-    <w:lsdException w:name="toc 5" w:uiPriority="39" w:semiHidden="1" w:unhideWhenUsed="1"/>
-    <w:lsdException w:name="toc 6" w:uiPriority="39" w:semiHidden="1" w:unhideWhenUsed="1"/>
-    <w:lsdException w:name="toc 7" w:uiPriority="39" w:semiHidden="1" w:unhideWhenUsed="1"/>
-    <w:lsdException w:name="toc 8" w:uiPriority="39" w:semiHidden="1" w:unhideWhenUsed="1"/>
-    <w:lsdException w:name="toc 9" w:uiPriority="39" w:semiHidden="1" w:unhideWhenUsed="1"/>
+    <w:lsdException w:name="toc 1" w:semiHidden="1" w:uiPriority="39" w:unhideWhenUsed="1"/>
+    <w:lsdException w:name="toc 2" w:semiHidden="1" w:uiPriority="39" w:unhideWhenUsed="1"/>
+    <w:lsdException w:name="toc 3" w:semiHidden="1" w:uiPriority="39" w:unhideWhenUsed="1"/>
+    <w:lsdException w:name="toc 4" w:semiHidden="1" w:uiPriority="39" w:unhideWhenUsed="1"/>
+    <w:lsdException w:name="toc 5" w:semiHidden="1" w:uiPriority="39" w:unhideWhenUsed="1"/>
+    <w:lsdException w:name="toc 6" w:semiHidden="1" w:uiPriority="39" w:unhideWhenUsed="1"/>
+    <w:lsdException w:name="toc 7" w:semiHidden="1" w:uiPriority="39" w:unhideWhenUsed="1"/>
+    <w:lsdException w:name="toc 8" w:semiHidden="1" w:uiPriority="39" w:unhideWhenUsed="1"/>
+    <w:lsdException w:name="toc 9" w:semiHidden="1" w:uiPriority="39" w:unhideWhenUsed="1"/>
     <w:lsdException w:name="Normal Indent" w:semiHidden="1" w:unhideWhenUsed="1"/>
     <w:lsdException w:name="footnote text" w:semiHidden="1" w:unhideWhenUsed="1"/>
     <w:lsdException w:name="annotation text" w:semiHidden="1" w:unhideWhenUsed="1"/>
     <w:lsdException w:name="header" w:semiHidden="1" w:unhideWhenUsed="1"/>
     <w:lsdException w:name="footer" w:semiHidden="1" w:unhideWhenUsed="1"/>
     <w:lsdException w:name="index heading" w:semiHidden="1" w:unhideWhenUsed="1"/>
-    <w:lsdException w:name="caption" w:uiPriority="35" w:semiHidden="1" w:unhideWhenUsed="1" w:qFormat="1"/>
+    <w:lsdException w:name="caption" w:semiHidden="1" w:uiPriority="35" w:unhideWhenUsed="1" w:qFormat="1"/>
     <w:lsdException w:name="table of figures" w:semiHidden="1" w:unhideWhenUsed="1"/>
     <w:lsdException w:name="envelope address" w:semiHidden="1" w:unhideWhenUsed="1"/>
     <w:lsdException w:name="envelope return" w:semiHidden="1" w:unhideWhenUsed="1"/>
@@ -2588,7 +2580,7 @@
     <w:lsdException w:name="Title" w:uiPriority="10" w:qFormat="1"/>
     <w:lsdException w:name="Closing" w:semiHidden="1" w:unhideWhenUsed="1"/>
     <w:lsdException w:name="Signature" w:semiHidden="1" w:unhideWhenUsed="1"/>
-    <w:lsdException w:name="Default Paragraph Font" w:uiPriority="1" w:semiHidden="1" w:unhideWhenUsed="1"/>
+    <w:lsdException w:name="Default Paragraph Font" w:semiHidden="1" w:uiPriority="1" w:unhideWhenUsed="1"/>
     <w:lsdException w:name="Body Text" w:semiHidden="1" w:unhideWhenUsed="1"/>
     <w:lsdException w:name="Body Text Indent" w:semiHidden="1" w:unhideWhenUsed="1"/>
     <w:lsdException w:name="List Continue" w:semiHidden="1" w:unhideWhenUsed="1"/>
@@ -2788,8 +2780,8 @@
     <w:lsdException w:name="Subtle Reference" w:uiPriority="31" w:qFormat="1"/>
     <w:lsdException w:name="Intense Reference" w:uiPriority="32" w:qFormat="1"/>
     <w:lsdException w:name="Book Title" w:uiPriority="33" w:qFormat="1"/>
-    <w:lsdException w:name="Bibliography" w:uiPriority="37" w:semiHidden="1" w:unhideWhenUsed="1"/>
-    <w:lsdException w:name="TOC Heading" w:uiPriority="39" w:semiHidden="1" w:unhideWhenUsed="1" w:qFormat="1"/>
+    <w:lsdException w:name="Bibliography" w:semiHidden="1" w:uiPriority="37" w:unhideWhenUsed="1"/>
+    <w:lsdException w:name="TOC Heading" w:semiHidden="1" w:uiPriority="39" w:unhideWhenUsed="1" w:qFormat="1"/>
     <w:lsdException w:name="Plain Table 1" w:uiPriority="41"/>
     <w:lsdException w:name="Plain Table 2" w:uiPriority="42"/>
     <w:lsdException w:name="Plain Table 3" w:uiPriority="43"/>
@@ -2900,7 +2892,7 @@
     <w:lsdException w:name="Unresolved Mention" w:semiHidden="1" w:unhideWhenUsed="1"/>
     <w:lsdException w:name="Smart Link" w:semiHidden="1" w:unhideWhenUsed="1"/>
   </w:latentStyles>
-  <w:style w:type="paragraph" w:styleId="Normal" w:default="1">
+  <w:style w:type="paragraph" w:default="1" w:styleId="Normal">
     <w:name w:val="Normal"/>
     <w:qFormat/>
   </w:style>
@@ -2919,7 +2911,7 @@
       <w:outlineLvl w:val="0"/>
     </w:pPr>
     <w:rPr>
-      <w:rFonts w:asciiTheme="majorHAnsi" w:hAnsiTheme="majorHAnsi" w:eastAsiaTheme="majorEastAsia" w:cstheme="majorBidi"/>
+      <w:rFonts w:asciiTheme="majorHAnsi" w:eastAsiaTheme="majorEastAsia" w:hAnsiTheme="majorHAnsi" w:cstheme="majorBidi"/>
       <w:color w:val="0F4761" w:themeColor="accent1" w:themeShade="BF"/>
       <w:sz w:val="40"/>
       <w:szCs w:val="40"/>
@@ -2942,7 +2934,7 @@
       <w:outlineLvl w:val="1"/>
     </w:pPr>
     <w:rPr>
-      <w:rFonts w:asciiTheme="majorHAnsi" w:hAnsiTheme="majorHAnsi" w:eastAsiaTheme="majorEastAsia" w:cstheme="majorBidi"/>
+      <w:rFonts w:asciiTheme="majorHAnsi" w:eastAsiaTheme="majorEastAsia" w:hAnsiTheme="majorHAnsi" w:cstheme="majorBidi"/>
       <w:color w:val="0F4761" w:themeColor="accent1" w:themeShade="BF"/>
       <w:sz w:val="32"/>
       <w:szCs w:val="32"/>
@@ -3103,13 +3095,13 @@
       <w:color w:val="272727" w:themeColor="text1" w:themeTint="D8"/>
     </w:rPr>
   </w:style>
-  <w:style w:type="character" w:styleId="DefaultParagraphFont" w:default="1">
+  <w:style w:type="character" w:default="1" w:styleId="DefaultParagraphFont">
     <w:name w:val="Default Paragraph Font"/>
     <w:uiPriority w:val="1"/>
     <w:semiHidden/>
     <w:unhideWhenUsed/>
   </w:style>
-  <w:style w:type="table" w:styleId="TableNormal" w:default="1">
+  <w:style w:type="table" w:default="1" w:styleId="TableNormal">
     <w:name w:val="Normal Table"/>
     <w:uiPriority w:val="99"/>
     <w:semiHidden/>
@@ -3124,26 +3116,26 @@
       </w:tblCellMar>
     </w:tblPr>
   </w:style>
-  <w:style w:type="numbering" w:styleId="NoList" w:default="1">
+  <w:style w:type="numbering" w:default="1" w:styleId="NoList">
     <w:name w:val="No List"/>
     <w:uiPriority w:val="99"/>
     <w:semiHidden/>
     <w:unhideWhenUsed/>
   </w:style>
-  <w:style w:type="character" w:styleId="Heading1Char" w:customStyle="1">
+  <w:style w:type="character" w:customStyle="1" w:styleId="Heading1Char">
     <w:name w:val="Heading 1 Char"/>
     <w:basedOn w:val="DefaultParagraphFont"/>
     <w:link w:val="Heading1"/>
     <w:uiPriority w:val="9"/>
     <w:rsid w:val="00246733"/>
     <w:rPr>
-      <w:rFonts w:asciiTheme="majorHAnsi" w:hAnsiTheme="majorHAnsi" w:eastAsiaTheme="majorEastAsia" w:cstheme="majorBidi"/>
+      <w:rFonts w:asciiTheme="majorHAnsi" w:eastAsiaTheme="majorEastAsia" w:hAnsiTheme="majorHAnsi" w:cstheme="majorBidi"/>
       <w:color w:val="0F4761" w:themeColor="accent1" w:themeShade="BF"/>
       <w:sz w:val="40"/>
       <w:szCs w:val="40"/>
     </w:rPr>
   </w:style>
-  <w:style w:type="character" w:styleId="Heading2Char" w:customStyle="1">
+  <w:style w:type="character" w:customStyle="1" w:styleId="Heading2Char">
     <w:name w:val="Heading 2 Char"/>
     <w:basedOn w:val="DefaultParagraphFont"/>
     <w:link w:val="Heading2"/>
@@ -3151,13 +3143,13 @@
     <w:semiHidden/>
     <w:rsid w:val="00246733"/>
     <w:rPr>
-      <w:rFonts w:asciiTheme="majorHAnsi" w:hAnsiTheme="majorHAnsi" w:eastAsiaTheme="majorEastAsia" w:cstheme="majorBidi"/>
+      <w:rFonts w:asciiTheme="majorHAnsi" w:eastAsiaTheme="majorEastAsia" w:hAnsiTheme="majorHAnsi" w:cstheme="majorBidi"/>
       <w:color w:val="0F4761" w:themeColor="accent1" w:themeShade="BF"/>
       <w:sz w:val="32"/>
       <w:szCs w:val="32"/>
     </w:rPr>
   </w:style>
-  <w:style w:type="character" w:styleId="Heading3Char" w:customStyle="1">
+  <w:style w:type="character" w:customStyle="1" w:styleId="Heading3Char">
     <w:name w:val="Heading 3 Char"/>
     <w:basedOn w:val="DefaultParagraphFont"/>
     <w:link w:val="Heading3"/>
@@ -3171,7 +3163,7 @@
       <w:szCs w:val="28"/>
     </w:rPr>
   </w:style>
-  <w:style w:type="character" w:styleId="Heading4Char" w:customStyle="1">
+  <w:style w:type="character" w:customStyle="1" w:styleId="Heading4Char">
     <w:name w:val="Heading 4 Char"/>
     <w:basedOn w:val="DefaultParagraphFont"/>
     <w:link w:val="Heading4"/>
@@ -3185,7 +3177,7 @@
       <w:color w:val="0F4761" w:themeColor="accent1" w:themeShade="BF"/>
     </w:rPr>
   </w:style>
-  <w:style w:type="character" w:styleId="Heading5Char" w:customStyle="1">
+  <w:style w:type="character" w:customStyle="1" w:styleId="Heading5Char">
     <w:name w:val="Heading 5 Char"/>
     <w:basedOn w:val="DefaultParagraphFont"/>
     <w:link w:val="Heading5"/>
@@ -3197,7 +3189,7 @@
       <w:color w:val="0F4761" w:themeColor="accent1" w:themeShade="BF"/>
     </w:rPr>
   </w:style>
-  <w:style w:type="character" w:styleId="Heading6Char" w:customStyle="1">
+  <w:style w:type="character" w:customStyle="1" w:styleId="Heading6Char">
     <w:name w:val="Heading 6 Char"/>
     <w:basedOn w:val="DefaultParagraphFont"/>
     <w:link w:val="Heading6"/>
@@ -3211,7 +3203,7 @@
       <w:color w:val="595959" w:themeColor="text1" w:themeTint="A6"/>
     </w:rPr>
   </w:style>
-  <w:style w:type="character" w:styleId="Heading7Char" w:customStyle="1">
+  <w:style w:type="character" w:customStyle="1" w:styleId="Heading7Char">
     <w:name w:val="Heading 7 Char"/>
     <w:basedOn w:val="DefaultParagraphFont"/>
     <w:link w:val="Heading7"/>
@@ -3223,7 +3215,7 @@
       <w:color w:val="595959" w:themeColor="text1" w:themeTint="A6"/>
     </w:rPr>
   </w:style>
-  <w:style w:type="character" w:styleId="Heading8Char" w:customStyle="1">
+  <w:style w:type="character" w:customStyle="1" w:styleId="Heading8Char">
     <w:name w:val="Heading 8 Char"/>
     <w:basedOn w:val="DefaultParagraphFont"/>
     <w:link w:val="Heading8"/>
@@ -3237,7 +3229,7 @@
       <w:color w:val="272727" w:themeColor="text1" w:themeTint="D8"/>
     </w:rPr>
   </w:style>
-  <w:style w:type="character" w:styleId="Heading9Char" w:customStyle="1">
+  <w:style w:type="character" w:customStyle="1" w:styleId="Heading9Char">
     <w:name w:val="Heading 9 Char"/>
     <w:basedOn w:val="DefaultParagraphFont"/>
     <w:link w:val="Heading9"/>
@@ -3262,21 +3254,21 @@
       <w:contextualSpacing/>
     </w:pPr>
     <w:rPr>
-      <w:rFonts w:asciiTheme="majorHAnsi" w:hAnsiTheme="majorHAnsi" w:eastAsiaTheme="majorEastAsia" w:cstheme="majorBidi"/>
+      <w:rFonts w:asciiTheme="majorHAnsi" w:eastAsiaTheme="majorEastAsia" w:hAnsiTheme="majorHAnsi" w:cstheme="majorBidi"/>
       <w:spacing w:val="-10"/>
       <w:kern w:val="28"/>
       <w:sz w:val="56"/>
       <w:szCs w:val="56"/>
     </w:rPr>
   </w:style>
-  <w:style w:type="character" w:styleId="TitleChar" w:customStyle="1">
+  <w:style w:type="character" w:customStyle="1" w:styleId="TitleChar">
     <w:name w:val="Title Char"/>
     <w:basedOn w:val="DefaultParagraphFont"/>
     <w:link w:val="Title"/>
     <w:uiPriority w:val="10"/>
     <w:rsid w:val="00246733"/>
     <w:rPr>
-      <w:rFonts w:asciiTheme="majorHAnsi" w:hAnsiTheme="majorHAnsi" w:eastAsiaTheme="majorEastAsia" w:cstheme="majorBidi"/>
+      <w:rFonts w:asciiTheme="majorHAnsi" w:eastAsiaTheme="majorEastAsia" w:hAnsiTheme="majorHAnsi" w:cstheme="majorBidi"/>
       <w:spacing w:val="-10"/>
       <w:kern w:val="28"/>
       <w:sz w:val="56"/>
@@ -3304,7 +3296,7 @@
       <w:szCs w:val="28"/>
     </w:rPr>
   </w:style>
-  <w:style w:type="character" w:styleId="SubtitleChar" w:customStyle="1">
+  <w:style w:type="character" w:customStyle="1" w:styleId="SubtitleChar">
     <w:name w:val="Subtitle Char"/>
     <w:basedOn w:val="DefaultParagraphFont"/>
     <w:link w:val="Subtitle"/>
@@ -3336,7 +3328,7 @@
       <w:color w:val="404040" w:themeColor="text1" w:themeTint="BF"/>
     </w:rPr>
   </w:style>
-  <w:style w:type="character" w:styleId="QuoteChar" w:customStyle="1">
+  <w:style w:type="character" w:customStyle="1" w:styleId="QuoteChar">
     <w:name w:val="Quote Char"/>
     <w:basedOn w:val="DefaultParagraphFont"/>
     <w:link w:val="Quote"/>
@@ -3381,8 +3373,8 @@
     <w:rsid w:val="00246733"/>
     <w:pPr>
       <w:pBdr>
-        <w:top w:val="single" w:color="0F4761" w:themeColor="accent1" w:themeShade="BF" w:sz="4" w:space="10"/>
-        <w:bottom w:val="single" w:color="0F4761" w:themeColor="accent1" w:themeShade="BF" w:sz="4" w:space="10"/>
+        <w:top w:val="single" w:sz="4" w:space="10" w:color="0F4761" w:themeColor="accent1" w:themeShade="BF"/>
+        <w:bottom w:val="single" w:sz="4" w:space="10" w:color="0F4761" w:themeColor="accent1" w:themeShade="BF"/>
       </w:pBdr>
       <w:spacing w:before="360" w:after="360"/>
       <w:ind w:left="864" w:right="864"/>
@@ -3394,7 +3386,7 @@
       <w:color w:val="0F4761" w:themeColor="accent1" w:themeShade="BF"/>
     </w:rPr>
   </w:style>
-  <w:style w:type="character" w:styleId="IntenseQuoteChar" w:customStyle="1">
+  <w:style w:type="character" w:customStyle="1" w:styleId="IntenseQuoteChar">
     <w:name w:val="Intense Quote Char"/>
     <w:basedOn w:val="DefaultParagraphFont"/>
     <w:link w:val="IntenseQuote"/>
@@ -3438,7 +3430,7 @@
       <w14:ligatures w14:val="none"/>
     </w:rPr>
   </w:style>
-  <w:style w:type="character" w:styleId="NoSpacingChar" w:customStyle="1">
+  <w:style w:type="character" w:customStyle="1" w:styleId="NoSpacingChar">
     <w:name w:val="No Spacing Char"/>
     <w:basedOn w:val="DefaultParagraphFont"/>
     <w:link w:val="NoSpacing"/>
@@ -3468,7 +3460,7 @@
       <w:spacing w:after="0" w:line="240" w:lineRule="auto"/>
     </w:pPr>
   </w:style>
-  <w:style w:type="character" w:styleId="HeaderChar" w:customStyle="1">
+  <w:style w:type="character" w:customStyle="1" w:styleId="HeaderChar">
     <w:name w:val="Header Char"/>
     <w:basedOn w:val="DefaultParagraphFont"/>
     <w:link w:val="Header"/>
@@ -3490,7 +3482,7 @@
       <w:spacing w:after="0" w:line="240" w:lineRule="auto"/>
     </w:pPr>
   </w:style>
-  <w:style w:type="character" w:styleId="FooterChar" w:customStyle="1">
+  <w:style w:type="character" w:customStyle="1" w:styleId="FooterChar">
     <w:name w:val="Footer Char"/>
     <w:basedOn w:val="DefaultParagraphFont"/>
     <w:link w:val="Footer"/>
@@ -3501,7 +3493,7 @@
 </file>
 
 <file path=word/theme/theme1.xml><?xml version="1.0" encoding="utf-8"?>
-<a:theme xmlns:a="http://schemas.openxmlformats.org/drawingml/2006/main" xmlns:thm15="http://schemas.microsoft.com/office/thememl/2012/main" name="Office Theme">
+<a:theme xmlns:a="http://schemas.openxmlformats.org/drawingml/2006/main" name="Office Theme">
   <a:themeElements>
     <a:clrScheme name="Office">
       <a:dk1>

</xml_diff>

<commit_message>
edits throught all pages
</commit_message>
<xml_diff>
--- a/Documents/Changelog.docx
+++ b/Documents/Changelog.docx
@@ -1,6 +1,6 @@
 
 <file path=word/document.xml><?xml version="1.0" encoding="utf-8"?>
-<w:document xmlns:wpc="http://schemas.microsoft.com/office/word/2010/wordprocessingCanvas" xmlns:cx="http://schemas.microsoft.com/office/drawing/2014/chartex" xmlns:cx1="http://schemas.microsoft.com/office/drawing/2015/9/8/chartex" xmlns:cx2="http://schemas.microsoft.com/office/drawing/2015/10/21/chartex" xmlns:cx3="http://schemas.microsoft.com/office/drawing/2016/5/9/chartex" xmlns:cx4="http://schemas.microsoft.com/office/drawing/2016/5/10/chartex" xmlns:cx5="http://schemas.microsoft.com/office/drawing/2016/5/11/chartex" xmlns:cx6="http://schemas.microsoft.com/office/drawing/2016/5/12/chartex" xmlns:cx7="http://schemas.microsoft.com/office/drawing/2016/5/13/chartex" xmlns:cx8="http://schemas.microsoft.com/office/drawing/2016/5/14/chartex" xmlns:mc="http://schemas.openxmlformats.org/markup-compatibility/2006" xmlns:aink="http://schemas.microsoft.com/office/drawing/2016/ink" xmlns:am3d="http://schemas.microsoft.com/office/drawing/2017/model3d" xmlns:o="urn:schemas-microsoft-com:office:office" xmlns:oel="http://schemas.microsoft.com/office/2019/extlst" xmlns:r="http://schemas.openxmlformats.org/officeDocument/2006/relationships" xmlns:m="http://schemas.openxmlformats.org/officeDocument/2006/math" xmlns:v="urn:schemas-microsoft-com:vml" xmlns:wp14="http://schemas.microsoft.com/office/word/2010/wordprocessingDrawing" xmlns:wp="http://schemas.openxmlformats.org/drawingml/2006/wordprocessingDrawing" xmlns:w10="urn:schemas-microsoft-com:office:word" xmlns:w="http://schemas.openxmlformats.org/wordprocessingml/2006/main" xmlns:w14="http://schemas.microsoft.com/office/word/2010/wordml" xmlns:w15="http://schemas.microsoft.com/office/word/2012/wordml" xmlns:w16cex="http://schemas.microsoft.com/office/word/2018/wordml/cex" xmlns:w16cid="http://schemas.microsoft.com/office/word/2016/wordml/cid" xmlns:w16="http://schemas.microsoft.com/office/word/2018/wordml" xmlns:w16du="http://schemas.microsoft.com/office/word/2023/wordml/word16du" xmlns:w16sdtdh="http://schemas.microsoft.com/office/word/2020/wordml/sdtdatahash" xmlns:w16sdtfl="http://schemas.microsoft.com/office/word/2024/wordml/sdtformatlock" xmlns:w16se="http://schemas.microsoft.com/office/word/2015/wordml/symex" xmlns:wpg="http://schemas.microsoft.com/office/word/2010/wordprocessingGroup" xmlns:wpi="http://schemas.microsoft.com/office/word/2010/wordprocessingInk" xmlns:wne="http://schemas.microsoft.com/office/word/2006/wordml" xmlns:wps="http://schemas.microsoft.com/office/word/2010/wordprocessingShape" mc:Ignorable="w14 w15 w16se w16cid w16 w16cex w16sdtdh w16sdtfl w16du wp14">
+<w:document xmlns:wpc="http://schemas.microsoft.com/office/word/2010/wordprocessingCanvas" xmlns:cx="http://schemas.microsoft.com/office/drawing/2014/chartex" xmlns:cx1="http://schemas.microsoft.com/office/drawing/2015/9/8/chartex" xmlns:cx2="http://schemas.microsoft.com/office/drawing/2015/10/21/chartex" xmlns:cx3="http://schemas.microsoft.com/office/drawing/2016/5/9/chartex" xmlns:cx4="http://schemas.microsoft.com/office/drawing/2016/5/10/chartex" xmlns:cx5="http://schemas.microsoft.com/office/drawing/2016/5/11/chartex" xmlns:cx6="http://schemas.microsoft.com/office/drawing/2016/5/12/chartex" xmlns:cx7="http://schemas.microsoft.com/office/drawing/2016/5/13/chartex" xmlns:cx8="http://schemas.microsoft.com/office/drawing/2016/5/14/chartex" xmlns:mc="http://schemas.openxmlformats.org/markup-compatibility/2006" xmlns:aink="http://schemas.microsoft.com/office/drawing/2016/ink" xmlns:am3d="http://schemas.microsoft.com/office/drawing/2017/model3d" xmlns:o="urn:schemas-microsoft-com:office:office" xmlns:oel="http://schemas.microsoft.com/office/2019/extlst" xmlns:r="http://schemas.openxmlformats.org/officeDocument/2006/relationships" xmlns:m="http://schemas.openxmlformats.org/officeDocument/2006/math" xmlns:v="urn:schemas-microsoft-com:vml" xmlns:wp14="http://schemas.microsoft.com/office/word/2010/wordprocessingDrawing" xmlns:wp="http://schemas.openxmlformats.org/drawingml/2006/wordprocessingDrawing" xmlns:w10="urn:schemas-microsoft-com:office:word" xmlns:w="http://schemas.openxmlformats.org/wordprocessingml/2006/main" xmlns:w14="http://schemas.microsoft.com/office/word/2010/wordml" xmlns:w15="http://schemas.microsoft.com/office/word/2012/wordml" xmlns:w16cex="http://schemas.microsoft.com/office/word/2018/wordml/cex" xmlns:w16cid="http://schemas.microsoft.com/office/word/2016/wordml/cid" xmlns:w16="http://schemas.microsoft.com/office/word/2018/wordml" xmlns:w16du="http://schemas.microsoft.com/office/word/2023/wordml/word16du" xmlns:w16sdtdh="http://schemas.microsoft.com/office/word/2020/wordml/sdtdatahash" xmlns:w16sdtfl="http://schemas.microsoft.com/office/word/2024/wordml/sdtformatlock" xmlns:w16se="http://schemas.microsoft.com/office/word/2015/wordml/symex" xmlns:wpg="http://schemas.microsoft.com/office/word/2010/wordprocessingGroup" xmlns:wpi="http://schemas.microsoft.com/office/word/2010/wordprocessingInk" xmlns:wne="http://schemas.microsoft.com/office/word/2006/wordml" xmlns:wps="http://schemas.microsoft.com/office/word/2010/wordprocessingShape" xmlns:a="http://schemas.openxmlformats.org/drawingml/2006/main" mc:Ignorable="w14 w15 w16se w16cid w16 w16cex w16sdtdh w16sdtfl w16du wp14">
   <w:body>
     <w:sdt>
       <w:sdtPr>
@@ -271,7 +271,7 @@
                   </wp:anchor>
                 </w:drawing>
               </mc:Choice>
-              <mc:Fallback xmlns:a="http://schemas.openxmlformats.org/drawingml/2006/main">
+              <mc:Fallback>
                 <w:pict>
                   <v:group id="Group 157" style="position:absolute;margin-left:0;margin-top:0;width:8in;height:95.7pt;z-index:251662336;mso-width-percent:941;mso-height-percent:121;mso-top-percent:23;mso-position-horizontal:center;mso-position-horizontal-relative:page;mso-position-vertical-relative:page;mso-width-percent:941;mso-height-percent:121;mso-top-percent:23" coordsize="73152,12161" coordorigin="" o:spid="_x0000_s1026" w14:anchorId="53B628AD" o:gfxdata="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">
                     <v:shape id="Rectangle 51" style="position:absolute;width:73152;height:11303;visibility:visible;mso-wrap-style:square;v-text-anchor:middle" coordsize="7312660,1129665" o:spid="_x0000_s1027" fillcolor="#156082 [3204]" stroked="f" strokeweight="1.5pt" path="m,l7312660,r,1129665l3619500,733425,,1091565,,xe" o:gfxdata="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">
@@ -441,7 +441,7 @@
                   </wp:anchor>
                 </w:drawing>
               </mc:Choice>
-              <mc:Fallback xmlns:a="http://schemas.openxmlformats.org/drawingml/2006/main">
+              <mc:Fallback>
                 <w:pict>
                   <v:shapetype id="_x0000_t202" coordsize="21600,21600" o:spt="202" path="m,l,21600r21600,l21600,xe" w14:anchorId="0ACF918D">
                     <v:stroke joinstyle="miter"/>
@@ -679,7 +679,7 @@
                   </wp:anchor>
                 </w:drawing>
               </mc:Choice>
-              <mc:Fallback xmlns:a="http://schemas.openxmlformats.org/drawingml/2006/main">
+              <mc:Fallback>
                 <w:pict>
                   <v:shape id="Text Box 161" style="position:absolute;margin-left:0;margin-top:0;width:8in;height:79.5pt;z-index:251661312;visibility:visible;mso-wrap-style:square;mso-width-percent:941;mso-height-percent:100;mso-top-percent:700;mso-wrap-distance-left:9pt;mso-wrap-distance-top:0;mso-wrap-distance-right:9pt;mso-wrap-distance-bottom:0;mso-position-horizontal:center;mso-position-horizontal-relative:page;mso-position-vertical-relative:page;mso-width-percent:941;mso-height-percent:100;mso-top-percent:700;mso-width-relative:page;mso-height-relative:page;v-text-anchor:top" o:spid="_x0000_s1027" filled="f" stroked="f" strokeweight=".5pt" type="#_x0000_t202" o:gfxdata="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" w14:anchorId="660F2046">
                     <v:textbox style="mso-fit-shape-to-text:t" inset="126pt,0,54pt,0">
@@ -930,7 +930,7 @@
                   </wp:anchor>
                 </w:drawing>
               </mc:Choice>
-              <mc:Fallback xmlns:a="http://schemas.openxmlformats.org/drawingml/2006/main">
+              <mc:Fallback>
                 <w:pict>
                   <v:shape id="Text Box 163" style="position:absolute;margin-left:0;margin-top:0;width:8in;height:286.5pt;z-index:251659264;visibility:visible;mso-wrap-style:square;mso-width-percent:941;mso-height-percent:363;mso-top-percent:300;mso-wrap-distance-left:9pt;mso-wrap-distance-top:0;mso-wrap-distance-right:9pt;mso-wrap-distance-bottom:0;mso-position-horizontal:center;mso-position-horizontal-relative:page;mso-position-vertical-relative:page;mso-width-percent:941;mso-height-percent:363;mso-top-percent:300;mso-width-relative:page;mso-height-relative:page;v-text-anchor:bottom" o:spid="_x0000_s1028" filled="f" stroked="f" strokeweight=".5pt" type="#_x0000_t202" o:gfxdata="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" w14:anchorId="1A9F0E54">
                     <v:textbox inset="126pt,0,54pt,0">
@@ -1071,6 +1071,7 @@
         <w:t>Changelog - Pabii's Retreat</w:t>
       </w:r>
     </w:p>
+    <w:p/>
     <w:p>
       <w:r>
         <w:t>10 July 2026 - Project Initialization &amp; Scope</w:t>
@@ -1426,29 +1427,36 @@
           <w:ilvl w:val="0"/>
           <w:numId w:val="6"/>
         </w:numPr>
-      </w:pPr>
-      <w:r>
+        <w:rPr/>
+      </w:pPr>
+      <w:r>
+        <w:rPr/>
         <w:t xml:space="preserve">Defined a </w:t>
       </w:r>
       <w:r>
+        <w:rPr/>
         <w:t>responsive breakpoint</w:t>
       </w:r>
       <w:r>
+        <w:rPr/>
         <w:t xml:space="preserve"> for different screen size</w:t>
       </w:r>
       <w:r>
+        <w:rPr/>
         <w:t>.</w:t>
       </w:r>
     </w:p>
+    <w:p/>
+    <w:p/>
     <w:sectPr>
       <w:footerReference w:type="default" r:id="rId10"/>
-      <w:pgSz w:w="11906" w:h="16838"/>
+      <w:pgSz w:w="11906" w:h="16838" w:orient="portrait"/>
       <w:pgMar w:top="1440" w:right="1440" w:bottom="1440" w:left="1440" w:header="708" w:footer="708" w:gutter="0"/>
       <w:pgBorders w:offsetFrom="page">
-        <w:top w:val="thinThickThinSmallGap" w:sz="24" w:space="24" w:color="BF4E14" w:themeColor="accent2" w:themeShade="BF"/>
-        <w:left w:val="thinThickThinSmallGap" w:sz="24" w:space="24" w:color="BF4E14" w:themeColor="accent2" w:themeShade="BF"/>
-        <w:bottom w:val="thinThickThinSmallGap" w:sz="24" w:space="24" w:color="BF4E14" w:themeColor="accent2" w:themeShade="BF"/>
-        <w:right w:val="thinThickThinSmallGap" w:sz="24" w:space="24" w:color="BF4E14" w:themeColor="accent2" w:themeShade="BF"/>
+        <w:top w:val="thinThickThinSmallGap" w:color="BF4E14" w:themeColor="accent2" w:themeShade="BF" w:sz="24" w:space="24"/>
+        <w:left w:val="thinThickThinSmallGap" w:color="BF4E14" w:themeColor="accent2" w:themeShade="BF" w:sz="24" w:space="24"/>
+        <w:bottom w:val="thinThickThinSmallGap" w:color="BF4E14" w:themeColor="accent2" w:themeShade="BF" w:sz="24" w:space="24"/>
+        <w:right w:val="thinThickThinSmallGap" w:color="BF4E14" w:themeColor="accent2" w:themeShade="BF" w:sz="24" w:space="24"/>
       </w:pgBorders>
       <w:pgNumType w:start="0"/>
       <w:cols w:space="708"/>
@@ -1577,7 +1585,7 @@
         <w:ind w:left="767" w:hanging="360"/>
       </w:pPr>
       <w:rPr>
-        <w:rFonts w:ascii="Wingdings" w:hAnsi="Wingdings" w:hint="default"/>
+        <w:rFonts w:hint="default" w:ascii="Wingdings" w:hAnsi="Wingdings"/>
       </w:rPr>
     </w:lvl>
     <w:lvl w:ilvl="1" w:tplc="1C090003" w:tentative="1">
@@ -1589,7 +1597,7 @@
         <w:ind w:left="1487" w:hanging="360"/>
       </w:pPr>
       <w:rPr>
-        <w:rFonts w:ascii="Courier New" w:hAnsi="Courier New" w:cs="Courier New" w:hint="default"/>
+        <w:rFonts w:hint="default" w:ascii="Courier New" w:hAnsi="Courier New" w:cs="Courier New"/>
       </w:rPr>
     </w:lvl>
     <w:lvl w:ilvl="2" w:tplc="1C090005" w:tentative="1">
@@ -1601,7 +1609,7 @@
         <w:ind w:left="2207" w:hanging="360"/>
       </w:pPr>
       <w:rPr>
-        <w:rFonts w:ascii="Wingdings" w:hAnsi="Wingdings" w:hint="default"/>
+        <w:rFonts w:hint="default" w:ascii="Wingdings" w:hAnsi="Wingdings"/>
       </w:rPr>
     </w:lvl>
     <w:lvl w:ilvl="3" w:tplc="1C090001" w:tentative="1">
@@ -1613,7 +1621,7 @@
         <w:ind w:left="2927" w:hanging="360"/>
       </w:pPr>
       <w:rPr>
-        <w:rFonts w:ascii="Symbol" w:hAnsi="Symbol" w:hint="default"/>
+        <w:rFonts w:hint="default" w:ascii="Symbol" w:hAnsi="Symbol"/>
       </w:rPr>
     </w:lvl>
     <w:lvl w:ilvl="4" w:tplc="1C090003" w:tentative="1">
@@ -1625,7 +1633,7 @@
         <w:ind w:left="3647" w:hanging="360"/>
       </w:pPr>
       <w:rPr>
-        <w:rFonts w:ascii="Courier New" w:hAnsi="Courier New" w:cs="Courier New" w:hint="default"/>
+        <w:rFonts w:hint="default" w:ascii="Courier New" w:hAnsi="Courier New" w:cs="Courier New"/>
       </w:rPr>
     </w:lvl>
     <w:lvl w:ilvl="5" w:tplc="1C090005" w:tentative="1">
@@ -1637,7 +1645,7 @@
         <w:ind w:left="4367" w:hanging="360"/>
       </w:pPr>
       <w:rPr>
-        <w:rFonts w:ascii="Wingdings" w:hAnsi="Wingdings" w:hint="default"/>
+        <w:rFonts w:hint="default" w:ascii="Wingdings" w:hAnsi="Wingdings"/>
       </w:rPr>
     </w:lvl>
     <w:lvl w:ilvl="6" w:tplc="1C090001" w:tentative="1">
@@ -1649,7 +1657,7 @@
         <w:ind w:left="5087" w:hanging="360"/>
       </w:pPr>
       <w:rPr>
-        <w:rFonts w:ascii="Symbol" w:hAnsi="Symbol" w:hint="default"/>
+        <w:rFonts w:hint="default" w:ascii="Symbol" w:hAnsi="Symbol"/>
       </w:rPr>
     </w:lvl>
     <w:lvl w:ilvl="7" w:tplc="1C090003" w:tentative="1">
@@ -1661,7 +1669,7 @@
         <w:ind w:left="5807" w:hanging="360"/>
       </w:pPr>
       <w:rPr>
-        <w:rFonts w:ascii="Courier New" w:hAnsi="Courier New" w:cs="Courier New" w:hint="default"/>
+        <w:rFonts w:hint="default" w:ascii="Courier New" w:hAnsi="Courier New" w:cs="Courier New"/>
       </w:rPr>
     </w:lvl>
     <w:lvl w:ilvl="8" w:tplc="1C090005" w:tentative="1">
@@ -1673,7 +1681,7 @@
         <w:ind w:left="6527" w:hanging="360"/>
       </w:pPr>
       <w:rPr>
-        <w:rFonts w:ascii="Wingdings" w:hAnsi="Wingdings" w:hint="default"/>
+        <w:rFonts w:hint="default" w:ascii="Wingdings" w:hAnsi="Wingdings"/>
       </w:rPr>
     </w:lvl>
   </w:abstractNum>
@@ -1690,7 +1698,7 @@
         <w:ind w:left="720" w:hanging="360"/>
       </w:pPr>
       <w:rPr>
-        <w:rFonts w:ascii="Wingdings" w:hAnsi="Wingdings" w:hint="default"/>
+        <w:rFonts w:hint="default" w:ascii="Wingdings" w:hAnsi="Wingdings"/>
       </w:rPr>
     </w:lvl>
     <w:lvl w:ilvl="1" w:tplc="1C090003" w:tentative="1">
@@ -1702,7 +1710,7 @@
         <w:ind w:left="1440" w:hanging="360"/>
       </w:pPr>
       <w:rPr>
-        <w:rFonts w:ascii="Courier New" w:hAnsi="Courier New" w:cs="Courier New" w:hint="default"/>
+        <w:rFonts w:hint="default" w:ascii="Courier New" w:hAnsi="Courier New" w:cs="Courier New"/>
       </w:rPr>
     </w:lvl>
     <w:lvl w:ilvl="2" w:tplc="1C090005" w:tentative="1">
@@ -1714,7 +1722,7 @@
         <w:ind w:left="2160" w:hanging="360"/>
       </w:pPr>
       <w:rPr>
-        <w:rFonts w:ascii="Wingdings" w:hAnsi="Wingdings" w:hint="default"/>
+        <w:rFonts w:hint="default" w:ascii="Wingdings" w:hAnsi="Wingdings"/>
       </w:rPr>
     </w:lvl>
     <w:lvl w:ilvl="3" w:tplc="1C090001" w:tentative="1">
@@ -1726,7 +1734,7 @@
         <w:ind w:left="2880" w:hanging="360"/>
       </w:pPr>
       <w:rPr>
-        <w:rFonts w:ascii="Symbol" w:hAnsi="Symbol" w:hint="default"/>
+        <w:rFonts w:hint="default" w:ascii="Symbol" w:hAnsi="Symbol"/>
       </w:rPr>
     </w:lvl>
     <w:lvl w:ilvl="4" w:tplc="1C090003" w:tentative="1">
@@ -1738,7 +1746,7 @@
         <w:ind w:left="3600" w:hanging="360"/>
       </w:pPr>
       <w:rPr>
-        <w:rFonts w:ascii="Courier New" w:hAnsi="Courier New" w:cs="Courier New" w:hint="default"/>
+        <w:rFonts w:hint="default" w:ascii="Courier New" w:hAnsi="Courier New" w:cs="Courier New"/>
       </w:rPr>
     </w:lvl>
     <w:lvl w:ilvl="5" w:tplc="1C090005" w:tentative="1">
@@ -1750,7 +1758,7 @@
         <w:ind w:left="4320" w:hanging="360"/>
       </w:pPr>
       <w:rPr>
-        <w:rFonts w:ascii="Wingdings" w:hAnsi="Wingdings" w:hint="default"/>
+        <w:rFonts w:hint="default" w:ascii="Wingdings" w:hAnsi="Wingdings"/>
       </w:rPr>
     </w:lvl>
     <w:lvl w:ilvl="6" w:tplc="1C090001" w:tentative="1">
@@ -1762,7 +1770,7 @@
         <w:ind w:left="5040" w:hanging="360"/>
       </w:pPr>
       <w:rPr>
-        <w:rFonts w:ascii="Symbol" w:hAnsi="Symbol" w:hint="default"/>
+        <w:rFonts w:hint="default" w:ascii="Symbol" w:hAnsi="Symbol"/>
       </w:rPr>
     </w:lvl>
     <w:lvl w:ilvl="7" w:tplc="1C090003" w:tentative="1">
@@ -1774,7 +1782,7 @@
         <w:ind w:left="5760" w:hanging="360"/>
       </w:pPr>
       <w:rPr>
-        <w:rFonts w:ascii="Courier New" w:hAnsi="Courier New" w:cs="Courier New" w:hint="default"/>
+        <w:rFonts w:hint="default" w:ascii="Courier New" w:hAnsi="Courier New" w:cs="Courier New"/>
       </w:rPr>
     </w:lvl>
     <w:lvl w:ilvl="8" w:tplc="1C090005" w:tentative="1">
@@ -1786,7 +1794,7 @@
         <w:ind w:left="6480" w:hanging="360"/>
       </w:pPr>
       <w:rPr>
-        <w:rFonts w:ascii="Wingdings" w:hAnsi="Wingdings" w:hint="default"/>
+        <w:rFonts w:hint="default" w:ascii="Wingdings" w:hAnsi="Wingdings"/>
       </w:rPr>
     </w:lvl>
   </w:abstractNum>
@@ -1803,7 +1811,7 @@
         <w:ind w:left="720" w:hanging="360"/>
       </w:pPr>
       <w:rPr>
-        <w:rFonts w:ascii="Wingdings" w:hAnsi="Wingdings" w:hint="default"/>
+        <w:rFonts w:hint="default" w:ascii="Wingdings" w:hAnsi="Wingdings"/>
       </w:rPr>
     </w:lvl>
     <w:lvl w:ilvl="1" w:tplc="1C090003" w:tentative="1">
@@ -1815,7 +1823,7 @@
         <w:ind w:left="1440" w:hanging="360"/>
       </w:pPr>
       <w:rPr>
-        <w:rFonts w:ascii="Courier New" w:hAnsi="Courier New" w:cs="Courier New" w:hint="default"/>
+        <w:rFonts w:hint="default" w:ascii="Courier New" w:hAnsi="Courier New" w:cs="Courier New"/>
       </w:rPr>
     </w:lvl>
     <w:lvl w:ilvl="2" w:tplc="1C090005" w:tentative="1">
@@ -1827,7 +1835,7 @@
         <w:ind w:left="2160" w:hanging="360"/>
       </w:pPr>
       <w:rPr>
-        <w:rFonts w:ascii="Wingdings" w:hAnsi="Wingdings" w:hint="default"/>
+        <w:rFonts w:hint="default" w:ascii="Wingdings" w:hAnsi="Wingdings"/>
       </w:rPr>
     </w:lvl>
     <w:lvl w:ilvl="3" w:tplc="1C090001" w:tentative="1">
@@ -1839,7 +1847,7 @@
         <w:ind w:left="2880" w:hanging="360"/>
       </w:pPr>
       <w:rPr>
-        <w:rFonts w:ascii="Symbol" w:hAnsi="Symbol" w:hint="default"/>
+        <w:rFonts w:hint="default" w:ascii="Symbol" w:hAnsi="Symbol"/>
       </w:rPr>
     </w:lvl>
     <w:lvl w:ilvl="4" w:tplc="1C090003" w:tentative="1">
@@ -1851,7 +1859,7 @@
         <w:ind w:left="3600" w:hanging="360"/>
       </w:pPr>
       <w:rPr>
-        <w:rFonts w:ascii="Courier New" w:hAnsi="Courier New" w:cs="Courier New" w:hint="default"/>
+        <w:rFonts w:hint="default" w:ascii="Courier New" w:hAnsi="Courier New" w:cs="Courier New"/>
       </w:rPr>
     </w:lvl>
     <w:lvl w:ilvl="5" w:tplc="1C090005" w:tentative="1">
@@ -1863,7 +1871,7 @@
         <w:ind w:left="4320" w:hanging="360"/>
       </w:pPr>
       <w:rPr>
-        <w:rFonts w:ascii="Wingdings" w:hAnsi="Wingdings" w:hint="default"/>
+        <w:rFonts w:hint="default" w:ascii="Wingdings" w:hAnsi="Wingdings"/>
       </w:rPr>
     </w:lvl>
     <w:lvl w:ilvl="6" w:tplc="1C090001" w:tentative="1">
@@ -1875,7 +1883,7 @@
         <w:ind w:left="5040" w:hanging="360"/>
       </w:pPr>
       <w:rPr>
-        <w:rFonts w:ascii="Symbol" w:hAnsi="Symbol" w:hint="default"/>
+        <w:rFonts w:hint="default" w:ascii="Symbol" w:hAnsi="Symbol"/>
       </w:rPr>
     </w:lvl>
     <w:lvl w:ilvl="7" w:tplc="1C090003" w:tentative="1">
@@ -1887,7 +1895,7 @@
         <w:ind w:left="5760" w:hanging="360"/>
       </w:pPr>
       <w:rPr>
-        <w:rFonts w:ascii="Courier New" w:hAnsi="Courier New" w:cs="Courier New" w:hint="default"/>
+        <w:rFonts w:hint="default" w:ascii="Courier New" w:hAnsi="Courier New" w:cs="Courier New"/>
       </w:rPr>
     </w:lvl>
     <w:lvl w:ilvl="8" w:tplc="1C090005" w:tentative="1">
@@ -1899,7 +1907,7 @@
         <w:ind w:left="6480" w:hanging="360"/>
       </w:pPr>
       <w:rPr>
-        <w:rFonts w:ascii="Wingdings" w:hAnsi="Wingdings" w:hint="default"/>
+        <w:rFonts w:hint="default" w:ascii="Wingdings" w:hAnsi="Wingdings"/>
       </w:rPr>
     </w:lvl>
   </w:abstractNum>
@@ -1916,7 +1924,7 @@
         <w:ind w:left="720" w:hanging="360"/>
       </w:pPr>
       <w:rPr>
-        <w:rFonts w:ascii="Wingdings" w:hAnsi="Wingdings" w:hint="default"/>
+        <w:rFonts w:hint="default" w:ascii="Wingdings" w:hAnsi="Wingdings"/>
       </w:rPr>
     </w:lvl>
     <w:lvl w:ilvl="1" w:tplc="1C090003" w:tentative="1">
@@ -1928,7 +1936,7 @@
         <w:ind w:left="1440" w:hanging="360"/>
       </w:pPr>
       <w:rPr>
-        <w:rFonts w:ascii="Courier New" w:hAnsi="Courier New" w:cs="Courier New" w:hint="default"/>
+        <w:rFonts w:hint="default" w:ascii="Courier New" w:hAnsi="Courier New" w:cs="Courier New"/>
       </w:rPr>
     </w:lvl>
     <w:lvl w:ilvl="2" w:tplc="1C090005" w:tentative="1">
@@ -1940,7 +1948,7 @@
         <w:ind w:left="2160" w:hanging="360"/>
       </w:pPr>
       <w:rPr>
-        <w:rFonts w:ascii="Wingdings" w:hAnsi="Wingdings" w:hint="default"/>
+        <w:rFonts w:hint="default" w:ascii="Wingdings" w:hAnsi="Wingdings"/>
       </w:rPr>
     </w:lvl>
     <w:lvl w:ilvl="3" w:tplc="1C090001" w:tentative="1">
@@ -1952,7 +1960,7 @@
         <w:ind w:left="2880" w:hanging="360"/>
       </w:pPr>
       <w:rPr>
-        <w:rFonts w:ascii="Symbol" w:hAnsi="Symbol" w:hint="default"/>
+        <w:rFonts w:hint="default" w:ascii="Symbol" w:hAnsi="Symbol"/>
       </w:rPr>
     </w:lvl>
     <w:lvl w:ilvl="4" w:tplc="1C090003" w:tentative="1">
@@ -1964,7 +1972,7 @@
         <w:ind w:left="3600" w:hanging="360"/>
       </w:pPr>
       <w:rPr>
-        <w:rFonts w:ascii="Courier New" w:hAnsi="Courier New" w:cs="Courier New" w:hint="default"/>
+        <w:rFonts w:hint="default" w:ascii="Courier New" w:hAnsi="Courier New" w:cs="Courier New"/>
       </w:rPr>
     </w:lvl>
     <w:lvl w:ilvl="5" w:tplc="1C090005" w:tentative="1">
@@ -1976,7 +1984,7 @@
         <w:ind w:left="4320" w:hanging="360"/>
       </w:pPr>
       <w:rPr>
-        <w:rFonts w:ascii="Wingdings" w:hAnsi="Wingdings" w:hint="default"/>
+        <w:rFonts w:hint="default" w:ascii="Wingdings" w:hAnsi="Wingdings"/>
       </w:rPr>
     </w:lvl>
     <w:lvl w:ilvl="6" w:tplc="1C090001" w:tentative="1">
@@ -1988,7 +1996,7 @@
         <w:ind w:left="5040" w:hanging="360"/>
       </w:pPr>
       <w:rPr>
-        <w:rFonts w:ascii="Symbol" w:hAnsi="Symbol" w:hint="default"/>
+        <w:rFonts w:hint="default" w:ascii="Symbol" w:hAnsi="Symbol"/>
       </w:rPr>
     </w:lvl>
     <w:lvl w:ilvl="7" w:tplc="1C090003" w:tentative="1">
@@ -2000,7 +2008,7 @@
         <w:ind w:left="5760" w:hanging="360"/>
       </w:pPr>
       <w:rPr>
-        <w:rFonts w:ascii="Courier New" w:hAnsi="Courier New" w:cs="Courier New" w:hint="default"/>
+        <w:rFonts w:hint="default" w:ascii="Courier New" w:hAnsi="Courier New" w:cs="Courier New"/>
       </w:rPr>
     </w:lvl>
     <w:lvl w:ilvl="8" w:tplc="1C090005" w:tentative="1">
@@ -2012,7 +2020,7 @@
         <w:ind w:left="6480" w:hanging="360"/>
       </w:pPr>
       <w:rPr>
-        <w:rFonts w:ascii="Wingdings" w:hAnsi="Wingdings" w:hint="default"/>
+        <w:rFonts w:hint="default" w:ascii="Wingdings" w:hAnsi="Wingdings"/>
       </w:rPr>
     </w:lvl>
   </w:abstractNum>
@@ -2029,7 +2037,7 @@
         <w:ind w:left="720" w:hanging="360"/>
       </w:pPr>
       <w:rPr>
-        <w:rFonts w:ascii="Wingdings" w:hAnsi="Wingdings" w:hint="default"/>
+        <w:rFonts w:hint="default" w:ascii="Wingdings" w:hAnsi="Wingdings"/>
       </w:rPr>
     </w:lvl>
     <w:lvl w:ilvl="1" w:tplc="1C090003" w:tentative="1">
@@ -2041,7 +2049,7 @@
         <w:ind w:left="1440" w:hanging="360"/>
       </w:pPr>
       <w:rPr>
-        <w:rFonts w:ascii="Courier New" w:hAnsi="Courier New" w:cs="Courier New" w:hint="default"/>
+        <w:rFonts w:hint="default" w:ascii="Courier New" w:hAnsi="Courier New" w:cs="Courier New"/>
       </w:rPr>
     </w:lvl>
     <w:lvl w:ilvl="2" w:tplc="1C090005" w:tentative="1">
@@ -2053,7 +2061,7 @@
         <w:ind w:left="2160" w:hanging="360"/>
       </w:pPr>
       <w:rPr>
-        <w:rFonts w:ascii="Wingdings" w:hAnsi="Wingdings" w:hint="default"/>
+        <w:rFonts w:hint="default" w:ascii="Wingdings" w:hAnsi="Wingdings"/>
       </w:rPr>
     </w:lvl>
     <w:lvl w:ilvl="3" w:tplc="1C090001" w:tentative="1">
@@ -2065,7 +2073,7 @@
         <w:ind w:left="2880" w:hanging="360"/>
       </w:pPr>
       <w:rPr>
-        <w:rFonts w:ascii="Symbol" w:hAnsi="Symbol" w:hint="default"/>
+        <w:rFonts w:hint="default" w:ascii="Symbol" w:hAnsi="Symbol"/>
       </w:rPr>
     </w:lvl>
     <w:lvl w:ilvl="4" w:tplc="1C090003" w:tentative="1">
@@ -2077,7 +2085,7 @@
         <w:ind w:left="3600" w:hanging="360"/>
       </w:pPr>
       <w:rPr>
-        <w:rFonts w:ascii="Courier New" w:hAnsi="Courier New" w:cs="Courier New" w:hint="default"/>
+        <w:rFonts w:hint="default" w:ascii="Courier New" w:hAnsi="Courier New" w:cs="Courier New"/>
       </w:rPr>
     </w:lvl>
     <w:lvl w:ilvl="5" w:tplc="1C090005" w:tentative="1">
@@ -2089,7 +2097,7 @@
         <w:ind w:left="4320" w:hanging="360"/>
       </w:pPr>
       <w:rPr>
-        <w:rFonts w:ascii="Wingdings" w:hAnsi="Wingdings" w:hint="default"/>
+        <w:rFonts w:hint="default" w:ascii="Wingdings" w:hAnsi="Wingdings"/>
       </w:rPr>
     </w:lvl>
     <w:lvl w:ilvl="6" w:tplc="1C090001" w:tentative="1">
@@ -2101,7 +2109,7 @@
         <w:ind w:left="5040" w:hanging="360"/>
       </w:pPr>
       <w:rPr>
-        <w:rFonts w:ascii="Symbol" w:hAnsi="Symbol" w:hint="default"/>
+        <w:rFonts w:hint="default" w:ascii="Symbol" w:hAnsi="Symbol"/>
       </w:rPr>
     </w:lvl>
     <w:lvl w:ilvl="7" w:tplc="1C090003" w:tentative="1">
@@ -2113,7 +2121,7 @@
         <w:ind w:left="5760" w:hanging="360"/>
       </w:pPr>
       <w:rPr>
-        <w:rFonts w:ascii="Courier New" w:hAnsi="Courier New" w:cs="Courier New" w:hint="default"/>
+        <w:rFonts w:hint="default" w:ascii="Courier New" w:hAnsi="Courier New" w:cs="Courier New"/>
       </w:rPr>
     </w:lvl>
     <w:lvl w:ilvl="8" w:tplc="1C090005" w:tentative="1">
@@ -2125,7 +2133,7 @@
         <w:ind w:left="6480" w:hanging="360"/>
       </w:pPr>
       <w:rPr>
-        <w:rFonts w:ascii="Wingdings" w:hAnsi="Wingdings" w:hint="default"/>
+        <w:rFonts w:hint="default" w:ascii="Wingdings" w:hAnsi="Wingdings"/>
       </w:rPr>
     </w:lvl>
   </w:abstractNum>
@@ -2142,7 +2150,7 @@
         <w:ind w:left="767" w:hanging="360"/>
       </w:pPr>
       <w:rPr>
-        <w:rFonts w:ascii="Wingdings" w:hAnsi="Wingdings" w:hint="default"/>
+        <w:rFonts w:hint="default" w:ascii="Wingdings" w:hAnsi="Wingdings"/>
       </w:rPr>
     </w:lvl>
     <w:lvl w:ilvl="1" w:tplc="1C090003" w:tentative="1">
@@ -2154,7 +2162,7 @@
         <w:ind w:left="1487" w:hanging="360"/>
       </w:pPr>
       <w:rPr>
-        <w:rFonts w:ascii="Courier New" w:hAnsi="Courier New" w:cs="Courier New" w:hint="default"/>
+        <w:rFonts w:hint="default" w:ascii="Courier New" w:hAnsi="Courier New" w:cs="Courier New"/>
       </w:rPr>
     </w:lvl>
     <w:lvl w:ilvl="2" w:tplc="1C090005" w:tentative="1">
@@ -2166,7 +2174,7 @@
         <w:ind w:left="2207" w:hanging="360"/>
       </w:pPr>
       <w:rPr>
-        <w:rFonts w:ascii="Wingdings" w:hAnsi="Wingdings" w:hint="default"/>
+        <w:rFonts w:hint="default" w:ascii="Wingdings" w:hAnsi="Wingdings"/>
       </w:rPr>
     </w:lvl>
     <w:lvl w:ilvl="3" w:tplc="1C090001" w:tentative="1">
@@ -2178,7 +2186,7 @@
         <w:ind w:left="2927" w:hanging="360"/>
       </w:pPr>
       <w:rPr>
-        <w:rFonts w:ascii="Symbol" w:hAnsi="Symbol" w:hint="default"/>
+        <w:rFonts w:hint="default" w:ascii="Symbol" w:hAnsi="Symbol"/>
       </w:rPr>
     </w:lvl>
     <w:lvl w:ilvl="4" w:tplc="1C090003" w:tentative="1">
@@ -2190,7 +2198,7 @@
         <w:ind w:left="3647" w:hanging="360"/>
       </w:pPr>
       <w:rPr>
-        <w:rFonts w:ascii="Courier New" w:hAnsi="Courier New" w:cs="Courier New" w:hint="default"/>
+        <w:rFonts w:hint="default" w:ascii="Courier New" w:hAnsi="Courier New" w:cs="Courier New"/>
       </w:rPr>
     </w:lvl>
     <w:lvl w:ilvl="5" w:tplc="1C090005" w:tentative="1">
@@ -2202,7 +2210,7 @@
         <w:ind w:left="4367" w:hanging="360"/>
       </w:pPr>
       <w:rPr>
-        <w:rFonts w:ascii="Wingdings" w:hAnsi="Wingdings" w:hint="default"/>
+        <w:rFonts w:hint="default" w:ascii="Wingdings" w:hAnsi="Wingdings"/>
       </w:rPr>
     </w:lvl>
     <w:lvl w:ilvl="6" w:tplc="1C090001" w:tentative="1">
@@ -2214,7 +2222,7 @@
         <w:ind w:left="5087" w:hanging="360"/>
       </w:pPr>
       <w:rPr>
-        <w:rFonts w:ascii="Symbol" w:hAnsi="Symbol" w:hint="default"/>
+        <w:rFonts w:hint="default" w:ascii="Symbol" w:hAnsi="Symbol"/>
       </w:rPr>
     </w:lvl>
     <w:lvl w:ilvl="7" w:tplc="1C090003" w:tentative="1">
@@ -2226,7 +2234,7 @@
         <w:ind w:left="5807" w:hanging="360"/>
       </w:pPr>
       <w:rPr>
-        <w:rFonts w:ascii="Courier New" w:hAnsi="Courier New" w:cs="Courier New" w:hint="default"/>
+        <w:rFonts w:hint="default" w:ascii="Courier New" w:hAnsi="Courier New" w:cs="Courier New"/>
       </w:rPr>
     </w:lvl>
     <w:lvl w:ilvl="8" w:tplc="1C090005" w:tentative="1">
@@ -2238,7 +2246,7 @@
         <w:ind w:left="6527" w:hanging="360"/>
       </w:pPr>
       <w:rPr>
-        <w:rFonts w:ascii="Wingdings" w:hAnsi="Wingdings" w:hint="default"/>
+        <w:rFonts w:hint="default" w:ascii="Wingdings" w:hAnsi="Wingdings"/>
       </w:rPr>
     </w:lvl>
   </w:abstractNum>
@@ -2255,7 +2263,7 @@
         <w:ind w:left="720" w:hanging="360"/>
       </w:pPr>
       <w:rPr>
-        <w:rFonts w:ascii="Wingdings" w:hAnsi="Wingdings" w:hint="default"/>
+        <w:rFonts w:hint="default" w:ascii="Wingdings" w:hAnsi="Wingdings"/>
       </w:rPr>
     </w:lvl>
     <w:lvl w:ilvl="1" w:tplc="1C090003" w:tentative="1">
@@ -2267,7 +2275,7 @@
         <w:ind w:left="1440" w:hanging="360"/>
       </w:pPr>
       <w:rPr>
-        <w:rFonts w:ascii="Courier New" w:hAnsi="Courier New" w:cs="Courier New" w:hint="default"/>
+        <w:rFonts w:hint="default" w:ascii="Courier New" w:hAnsi="Courier New" w:cs="Courier New"/>
       </w:rPr>
     </w:lvl>
     <w:lvl w:ilvl="2" w:tplc="1C090005" w:tentative="1">
@@ -2279,7 +2287,7 @@
         <w:ind w:left="2160" w:hanging="360"/>
       </w:pPr>
       <w:rPr>
-        <w:rFonts w:ascii="Wingdings" w:hAnsi="Wingdings" w:hint="default"/>
+        <w:rFonts w:hint="default" w:ascii="Wingdings" w:hAnsi="Wingdings"/>
       </w:rPr>
     </w:lvl>
     <w:lvl w:ilvl="3" w:tplc="1C090001" w:tentative="1">
@@ -2291,7 +2299,7 @@
         <w:ind w:left="2880" w:hanging="360"/>
       </w:pPr>
       <w:rPr>
-        <w:rFonts w:ascii="Symbol" w:hAnsi="Symbol" w:hint="default"/>
+        <w:rFonts w:hint="default" w:ascii="Symbol" w:hAnsi="Symbol"/>
       </w:rPr>
     </w:lvl>
     <w:lvl w:ilvl="4" w:tplc="1C090003" w:tentative="1">
@@ -2303,7 +2311,7 @@
         <w:ind w:left="3600" w:hanging="360"/>
       </w:pPr>
       <w:rPr>
-        <w:rFonts w:ascii="Courier New" w:hAnsi="Courier New" w:cs="Courier New" w:hint="default"/>
+        <w:rFonts w:hint="default" w:ascii="Courier New" w:hAnsi="Courier New" w:cs="Courier New"/>
       </w:rPr>
     </w:lvl>
     <w:lvl w:ilvl="5" w:tplc="1C090005" w:tentative="1">
@@ -2315,7 +2323,7 @@
         <w:ind w:left="4320" w:hanging="360"/>
       </w:pPr>
       <w:rPr>
-        <w:rFonts w:ascii="Wingdings" w:hAnsi="Wingdings" w:hint="default"/>
+        <w:rFonts w:hint="default" w:ascii="Wingdings" w:hAnsi="Wingdings"/>
       </w:rPr>
     </w:lvl>
     <w:lvl w:ilvl="6" w:tplc="1C090001" w:tentative="1">
@@ -2327,7 +2335,7 @@
         <w:ind w:left="5040" w:hanging="360"/>
       </w:pPr>
       <w:rPr>
-        <w:rFonts w:ascii="Symbol" w:hAnsi="Symbol" w:hint="default"/>
+        <w:rFonts w:hint="default" w:ascii="Symbol" w:hAnsi="Symbol"/>
       </w:rPr>
     </w:lvl>
     <w:lvl w:ilvl="7" w:tplc="1C090003" w:tentative="1">
@@ -2339,7 +2347,7 @@
         <w:ind w:left="5760" w:hanging="360"/>
       </w:pPr>
       <w:rPr>
-        <w:rFonts w:ascii="Courier New" w:hAnsi="Courier New" w:cs="Courier New" w:hint="default"/>
+        <w:rFonts w:hint="default" w:ascii="Courier New" w:hAnsi="Courier New" w:cs="Courier New"/>
       </w:rPr>
     </w:lvl>
     <w:lvl w:ilvl="8" w:tplc="1C090005" w:tentative="1">
@@ -2351,7 +2359,7 @@
         <w:ind w:left="6480" w:hanging="360"/>
       </w:pPr>
       <w:rPr>
-        <w:rFonts w:ascii="Wingdings" w:hAnsi="Wingdings" w:hint="default"/>
+        <w:rFonts w:hint="default" w:ascii="Wingdings" w:hAnsi="Wingdings"/>
       </w:rPr>
     </w:lvl>
   </w:abstractNum>
@@ -2368,7 +2376,7 @@
         <w:ind w:left="720" w:hanging="360"/>
       </w:pPr>
       <w:rPr>
-        <w:rFonts w:ascii="Wingdings" w:hAnsi="Wingdings" w:hint="default"/>
+        <w:rFonts w:hint="default" w:ascii="Wingdings" w:hAnsi="Wingdings"/>
       </w:rPr>
     </w:lvl>
     <w:lvl w:ilvl="1" w:tplc="1C090003" w:tentative="1">
@@ -2380,7 +2388,7 @@
         <w:ind w:left="1440" w:hanging="360"/>
       </w:pPr>
       <w:rPr>
-        <w:rFonts w:ascii="Courier New" w:hAnsi="Courier New" w:cs="Courier New" w:hint="default"/>
+        <w:rFonts w:hint="default" w:ascii="Courier New" w:hAnsi="Courier New" w:cs="Courier New"/>
       </w:rPr>
     </w:lvl>
     <w:lvl w:ilvl="2" w:tplc="1C090005" w:tentative="1">
@@ -2392,7 +2400,7 @@
         <w:ind w:left="2160" w:hanging="360"/>
       </w:pPr>
       <w:rPr>
-        <w:rFonts w:ascii="Wingdings" w:hAnsi="Wingdings" w:hint="default"/>
+        <w:rFonts w:hint="default" w:ascii="Wingdings" w:hAnsi="Wingdings"/>
       </w:rPr>
     </w:lvl>
     <w:lvl w:ilvl="3" w:tplc="1C090001" w:tentative="1">
@@ -2404,7 +2412,7 @@
         <w:ind w:left="2880" w:hanging="360"/>
       </w:pPr>
       <w:rPr>
-        <w:rFonts w:ascii="Symbol" w:hAnsi="Symbol" w:hint="default"/>
+        <w:rFonts w:hint="default" w:ascii="Symbol" w:hAnsi="Symbol"/>
       </w:rPr>
     </w:lvl>
     <w:lvl w:ilvl="4" w:tplc="1C090003" w:tentative="1">
@@ -2416,7 +2424,7 @@
         <w:ind w:left="3600" w:hanging="360"/>
       </w:pPr>
       <w:rPr>
-        <w:rFonts w:ascii="Courier New" w:hAnsi="Courier New" w:cs="Courier New" w:hint="default"/>
+        <w:rFonts w:hint="default" w:ascii="Courier New" w:hAnsi="Courier New" w:cs="Courier New"/>
       </w:rPr>
     </w:lvl>
     <w:lvl w:ilvl="5" w:tplc="1C090005" w:tentative="1">
@@ -2428,7 +2436,7 @@
         <w:ind w:left="4320" w:hanging="360"/>
       </w:pPr>
       <w:rPr>
-        <w:rFonts w:ascii="Wingdings" w:hAnsi="Wingdings" w:hint="default"/>
+        <w:rFonts w:hint="default" w:ascii="Wingdings" w:hAnsi="Wingdings"/>
       </w:rPr>
     </w:lvl>
     <w:lvl w:ilvl="6" w:tplc="1C090001" w:tentative="1">
@@ -2440,7 +2448,7 @@
         <w:ind w:left="5040" w:hanging="360"/>
       </w:pPr>
       <w:rPr>
-        <w:rFonts w:ascii="Symbol" w:hAnsi="Symbol" w:hint="default"/>
+        <w:rFonts w:hint="default" w:ascii="Symbol" w:hAnsi="Symbol"/>
       </w:rPr>
     </w:lvl>
     <w:lvl w:ilvl="7" w:tplc="1C090003" w:tentative="1">
@@ -2452,7 +2460,7 @@
         <w:ind w:left="5760" w:hanging="360"/>
       </w:pPr>
       <w:rPr>
-        <w:rFonts w:ascii="Courier New" w:hAnsi="Courier New" w:cs="Courier New" w:hint="default"/>
+        <w:rFonts w:hint="default" w:ascii="Courier New" w:hAnsi="Courier New" w:cs="Courier New"/>
       </w:rPr>
     </w:lvl>
     <w:lvl w:ilvl="8" w:tplc="1C090005" w:tentative="1">
@@ -2464,7 +2472,7 @@
         <w:ind w:left="6480" w:hanging="360"/>
       </w:pPr>
       <w:rPr>
-        <w:rFonts w:ascii="Wingdings" w:hAnsi="Wingdings" w:hint="default"/>
+        <w:rFonts w:hint="default" w:ascii="Wingdings" w:hAnsi="Wingdings"/>
       </w:rPr>
     </w:lvl>
   </w:abstractNum>
@@ -2500,7 +2508,7 @@
   <w:docDefaults>
     <w:rPrDefault>
       <w:rPr>
-        <w:rFonts w:asciiTheme="minorHAnsi" w:eastAsiaTheme="minorHAnsi" w:hAnsiTheme="minorHAnsi" w:cstheme="minorBidi"/>
+        <w:rFonts w:asciiTheme="minorHAnsi" w:hAnsiTheme="minorHAnsi" w:eastAsiaTheme="minorHAnsi" w:cstheme="minorBidi"/>
         <w:kern w:val="2"/>
         <w:sz w:val="24"/>
         <w:szCs w:val="24"/>
@@ -2517,14 +2525,14 @@
   <w:latentStyles w:defLockedState="0" w:defUIPriority="99" w:defSemiHidden="0" w:defUnhideWhenUsed="0" w:defQFormat="0" w:count="376">
     <w:lsdException w:name="Normal" w:uiPriority="0" w:qFormat="1"/>
     <w:lsdException w:name="heading 1" w:uiPriority="9" w:qFormat="1"/>
-    <w:lsdException w:name="heading 2" w:semiHidden="1" w:uiPriority="9" w:unhideWhenUsed="1" w:qFormat="1"/>
-    <w:lsdException w:name="heading 3" w:semiHidden="1" w:uiPriority="9" w:unhideWhenUsed="1" w:qFormat="1"/>
-    <w:lsdException w:name="heading 4" w:semiHidden="1" w:uiPriority="9" w:unhideWhenUsed="1" w:qFormat="1"/>
-    <w:lsdException w:name="heading 5" w:semiHidden="1" w:uiPriority="9" w:unhideWhenUsed="1" w:qFormat="1"/>
-    <w:lsdException w:name="heading 6" w:semiHidden="1" w:uiPriority="9" w:unhideWhenUsed="1" w:qFormat="1"/>
-    <w:lsdException w:name="heading 7" w:semiHidden="1" w:uiPriority="9" w:unhideWhenUsed="1" w:qFormat="1"/>
-    <w:lsdException w:name="heading 8" w:semiHidden="1" w:uiPriority="9" w:unhideWhenUsed="1" w:qFormat="1"/>
-    <w:lsdException w:name="heading 9" w:semiHidden="1" w:uiPriority="9" w:unhideWhenUsed="1" w:qFormat="1"/>
+    <w:lsdException w:name="heading 2" w:uiPriority="9" w:semiHidden="1" w:unhideWhenUsed="1" w:qFormat="1"/>
+    <w:lsdException w:name="heading 3" w:uiPriority="9" w:semiHidden="1" w:unhideWhenUsed="1" w:qFormat="1"/>
+    <w:lsdException w:name="heading 4" w:uiPriority="9" w:semiHidden="1" w:unhideWhenUsed="1" w:qFormat="1"/>
+    <w:lsdException w:name="heading 5" w:uiPriority="9" w:semiHidden="1" w:unhideWhenUsed="1" w:qFormat="1"/>
+    <w:lsdException w:name="heading 6" w:uiPriority="9" w:semiHidden="1" w:unhideWhenUsed="1" w:qFormat="1"/>
+    <w:lsdException w:name="heading 7" w:uiPriority="9" w:semiHidden="1" w:unhideWhenUsed="1" w:qFormat="1"/>
+    <w:lsdException w:name="heading 8" w:uiPriority="9" w:semiHidden="1" w:unhideWhenUsed="1" w:qFormat="1"/>
+    <w:lsdException w:name="heading 9" w:uiPriority="9" w:semiHidden="1" w:unhideWhenUsed="1" w:qFormat="1"/>
     <w:lsdException w:name="index 1" w:semiHidden="1" w:unhideWhenUsed="1"/>
     <w:lsdException w:name="index 2" w:semiHidden="1" w:unhideWhenUsed="1"/>
     <w:lsdException w:name="index 3" w:semiHidden="1" w:unhideWhenUsed="1"/>
@@ -2534,22 +2542,22 @@
     <w:lsdException w:name="index 7" w:semiHidden="1" w:unhideWhenUsed="1"/>
     <w:lsdException w:name="index 8" w:semiHidden="1" w:unhideWhenUsed="1"/>
     <w:lsdException w:name="index 9" w:semiHidden="1" w:unhideWhenUsed="1"/>
-    <w:lsdException w:name="toc 1" w:semiHidden="1" w:uiPriority="39" w:unhideWhenUsed="1"/>
-    <w:lsdException w:name="toc 2" w:semiHidden="1" w:uiPriority="39" w:unhideWhenUsed="1"/>
-    <w:lsdException w:name="toc 3" w:semiHidden="1" w:uiPriority="39" w:unhideWhenUsed="1"/>
-    <w:lsdException w:name="toc 4" w:semiHidden="1" w:uiPriority="39" w:unhideWhenUsed="1"/>
-    <w:lsdException w:name="toc 5" w:semiHidden="1" w:uiPriority="39" w:unhideWhenUsed="1"/>
-    <w:lsdException w:name="toc 6" w:semiHidden="1" w:uiPriority="39" w:unhideWhenUsed="1"/>
-    <w:lsdException w:name="toc 7" w:semiHidden="1" w:uiPriority="39" w:unhideWhenUsed="1"/>
-    <w:lsdException w:name="toc 8" w:semiHidden="1" w:uiPriority="39" w:unhideWhenUsed="1"/>
-    <w:lsdException w:name="toc 9" w:semiHidden="1" w:uiPriority="39" w:unhideWhenUsed="1"/>
+    <w:lsdException w:name="toc 1" w:uiPriority="39" w:semiHidden="1" w:unhideWhenUsed="1"/>
+    <w:lsdException w:name="toc 2" w:uiPriority="39" w:semiHidden="1" w:unhideWhenUsed="1"/>
+    <w:lsdException w:name="toc 3" w:uiPriority="39" w:semiHidden="1" w:unhideWhenUsed="1"/>
+    <w:lsdException w:name="toc 4" w:uiPriority="39" w:semiHidden="1" w:unhideWhenUsed="1"/>
+    <w:lsdException w:name="toc 5" w:uiPriority="39" w:semiHidden="1" w:unhideWhenUsed="1"/>
+    <w:lsdException w:name="toc 6" w:uiPriority="39" w:semiHidden="1" w:unhideWhenUsed="1"/>
+    <w:lsdException w:name="toc 7" w:uiPriority="39" w:semiHidden="1" w:unhideWhenUsed="1"/>
+    <w:lsdException w:name="toc 8" w:uiPriority="39" w:semiHidden="1" w:unhideWhenUsed="1"/>
+    <w:lsdException w:name="toc 9" w:uiPriority="39" w:semiHidden="1" w:unhideWhenUsed="1"/>
     <w:lsdException w:name="Normal Indent" w:semiHidden="1" w:unhideWhenUsed="1"/>
     <w:lsdException w:name="footnote text" w:semiHidden="1" w:unhideWhenUsed="1"/>
     <w:lsdException w:name="annotation text" w:semiHidden="1" w:unhideWhenUsed="1"/>
     <w:lsdException w:name="header" w:semiHidden="1" w:unhideWhenUsed="1"/>
     <w:lsdException w:name="footer" w:semiHidden="1" w:unhideWhenUsed="1"/>
     <w:lsdException w:name="index heading" w:semiHidden="1" w:unhideWhenUsed="1"/>
-    <w:lsdException w:name="caption" w:semiHidden="1" w:uiPriority="35" w:unhideWhenUsed="1" w:qFormat="1"/>
+    <w:lsdException w:name="caption" w:uiPriority="35" w:semiHidden="1" w:unhideWhenUsed="1" w:qFormat="1"/>
     <w:lsdException w:name="table of figures" w:semiHidden="1" w:unhideWhenUsed="1"/>
     <w:lsdException w:name="envelope address" w:semiHidden="1" w:unhideWhenUsed="1"/>
     <w:lsdException w:name="envelope return" w:semiHidden="1" w:unhideWhenUsed="1"/>
@@ -2580,7 +2588,7 @@
     <w:lsdException w:name="Title" w:uiPriority="10" w:qFormat="1"/>
     <w:lsdException w:name="Closing" w:semiHidden="1" w:unhideWhenUsed="1"/>
     <w:lsdException w:name="Signature" w:semiHidden="1" w:unhideWhenUsed="1"/>
-    <w:lsdException w:name="Default Paragraph Font" w:semiHidden="1" w:uiPriority="1" w:unhideWhenUsed="1"/>
+    <w:lsdException w:name="Default Paragraph Font" w:uiPriority="1" w:semiHidden="1" w:unhideWhenUsed="1"/>
     <w:lsdException w:name="Body Text" w:semiHidden="1" w:unhideWhenUsed="1"/>
     <w:lsdException w:name="Body Text Indent" w:semiHidden="1" w:unhideWhenUsed="1"/>
     <w:lsdException w:name="List Continue" w:semiHidden="1" w:unhideWhenUsed="1"/>
@@ -2780,8 +2788,8 @@
     <w:lsdException w:name="Subtle Reference" w:uiPriority="31" w:qFormat="1"/>
     <w:lsdException w:name="Intense Reference" w:uiPriority="32" w:qFormat="1"/>
     <w:lsdException w:name="Book Title" w:uiPriority="33" w:qFormat="1"/>
-    <w:lsdException w:name="Bibliography" w:semiHidden="1" w:uiPriority="37" w:unhideWhenUsed="1"/>
-    <w:lsdException w:name="TOC Heading" w:semiHidden="1" w:uiPriority="39" w:unhideWhenUsed="1" w:qFormat="1"/>
+    <w:lsdException w:name="Bibliography" w:uiPriority="37" w:semiHidden="1" w:unhideWhenUsed="1"/>
+    <w:lsdException w:name="TOC Heading" w:uiPriority="39" w:semiHidden="1" w:unhideWhenUsed="1" w:qFormat="1"/>
     <w:lsdException w:name="Plain Table 1" w:uiPriority="41"/>
     <w:lsdException w:name="Plain Table 2" w:uiPriority="42"/>
     <w:lsdException w:name="Plain Table 3" w:uiPriority="43"/>
@@ -2892,7 +2900,7 @@
     <w:lsdException w:name="Unresolved Mention" w:semiHidden="1" w:unhideWhenUsed="1"/>
     <w:lsdException w:name="Smart Link" w:semiHidden="1" w:unhideWhenUsed="1"/>
   </w:latentStyles>
-  <w:style w:type="paragraph" w:default="1" w:styleId="Normal">
+  <w:style w:type="paragraph" w:styleId="Normal" w:default="1">
     <w:name w:val="Normal"/>
     <w:qFormat/>
   </w:style>
@@ -2911,7 +2919,7 @@
       <w:outlineLvl w:val="0"/>
     </w:pPr>
     <w:rPr>
-      <w:rFonts w:asciiTheme="majorHAnsi" w:eastAsiaTheme="majorEastAsia" w:hAnsiTheme="majorHAnsi" w:cstheme="majorBidi"/>
+      <w:rFonts w:asciiTheme="majorHAnsi" w:hAnsiTheme="majorHAnsi" w:eastAsiaTheme="majorEastAsia" w:cstheme="majorBidi"/>
       <w:color w:val="0F4761" w:themeColor="accent1" w:themeShade="BF"/>
       <w:sz w:val="40"/>
       <w:szCs w:val="40"/>
@@ -2934,7 +2942,7 @@
       <w:outlineLvl w:val="1"/>
     </w:pPr>
     <w:rPr>
-      <w:rFonts w:asciiTheme="majorHAnsi" w:eastAsiaTheme="majorEastAsia" w:hAnsiTheme="majorHAnsi" w:cstheme="majorBidi"/>
+      <w:rFonts w:asciiTheme="majorHAnsi" w:hAnsiTheme="majorHAnsi" w:eastAsiaTheme="majorEastAsia" w:cstheme="majorBidi"/>
       <w:color w:val="0F4761" w:themeColor="accent1" w:themeShade="BF"/>
       <w:sz w:val="32"/>
       <w:szCs w:val="32"/>
@@ -3095,13 +3103,13 @@
       <w:color w:val="272727" w:themeColor="text1" w:themeTint="D8"/>
     </w:rPr>
   </w:style>
-  <w:style w:type="character" w:default="1" w:styleId="DefaultParagraphFont">
+  <w:style w:type="character" w:styleId="DefaultParagraphFont" w:default="1">
     <w:name w:val="Default Paragraph Font"/>
     <w:uiPriority w:val="1"/>
     <w:semiHidden/>
     <w:unhideWhenUsed/>
   </w:style>
-  <w:style w:type="table" w:default="1" w:styleId="TableNormal">
+  <w:style w:type="table" w:styleId="TableNormal" w:default="1">
     <w:name w:val="Normal Table"/>
     <w:uiPriority w:val="99"/>
     <w:semiHidden/>
@@ -3116,26 +3124,26 @@
       </w:tblCellMar>
     </w:tblPr>
   </w:style>
-  <w:style w:type="numbering" w:default="1" w:styleId="NoList">
+  <w:style w:type="numbering" w:styleId="NoList" w:default="1">
     <w:name w:val="No List"/>
     <w:uiPriority w:val="99"/>
     <w:semiHidden/>
     <w:unhideWhenUsed/>
   </w:style>
-  <w:style w:type="character" w:customStyle="1" w:styleId="Heading1Char">
+  <w:style w:type="character" w:styleId="Heading1Char" w:customStyle="1">
     <w:name w:val="Heading 1 Char"/>
     <w:basedOn w:val="DefaultParagraphFont"/>
     <w:link w:val="Heading1"/>
     <w:uiPriority w:val="9"/>
     <w:rsid w:val="00246733"/>
     <w:rPr>
-      <w:rFonts w:asciiTheme="majorHAnsi" w:eastAsiaTheme="majorEastAsia" w:hAnsiTheme="majorHAnsi" w:cstheme="majorBidi"/>
+      <w:rFonts w:asciiTheme="majorHAnsi" w:hAnsiTheme="majorHAnsi" w:eastAsiaTheme="majorEastAsia" w:cstheme="majorBidi"/>
       <w:color w:val="0F4761" w:themeColor="accent1" w:themeShade="BF"/>
       <w:sz w:val="40"/>
       <w:szCs w:val="40"/>
     </w:rPr>
   </w:style>
-  <w:style w:type="character" w:customStyle="1" w:styleId="Heading2Char">
+  <w:style w:type="character" w:styleId="Heading2Char" w:customStyle="1">
     <w:name w:val="Heading 2 Char"/>
     <w:basedOn w:val="DefaultParagraphFont"/>
     <w:link w:val="Heading2"/>
@@ -3143,13 +3151,13 @@
     <w:semiHidden/>
     <w:rsid w:val="00246733"/>
     <w:rPr>
-      <w:rFonts w:asciiTheme="majorHAnsi" w:eastAsiaTheme="majorEastAsia" w:hAnsiTheme="majorHAnsi" w:cstheme="majorBidi"/>
+      <w:rFonts w:asciiTheme="majorHAnsi" w:hAnsiTheme="majorHAnsi" w:eastAsiaTheme="majorEastAsia" w:cstheme="majorBidi"/>
       <w:color w:val="0F4761" w:themeColor="accent1" w:themeShade="BF"/>
       <w:sz w:val="32"/>
       <w:szCs w:val="32"/>
     </w:rPr>
   </w:style>
-  <w:style w:type="character" w:customStyle="1" w:styleId="Heading3Char">
+  <w:style w:type="character" w:styleId="Heading3Char" w:customStyle="1">
     <w:name w:val="Heading 3 Char"/>
     <w:basedOn w:val="DefaultParagraphFont"/>
     <w:link w:val="Heading3"/>
@@ -3163,7 +3171,7 @@
       <w:szCs w:val="28"/>
     </w:rPr>
   </w:style>
-  <w:style w:type="character" w:customStyle="1" w:styleId="Heading4Char">
+  <w:style w:type="character" w:styleId="Heading4Char" w:customStyle="1">
     <w:name w:val="Heading 4 Char"/>
     <w:basedOn w:val="DefaultParagraphFont"/>
     <w:link w:val="Heading4"/>
@@ -3177,7 +3185,7 @@
       <w:color w:val="0F4761" w:themeColor="accent1" w:themeShade="BF"/>
     </w:rPr>
   </w:style>
-  <w:style w:type="character" w:customStyle="1" w:styleId="Heading5Char">
+  <w:style w:type="character" w:styleId="Heading5Char" w:customStyle="1">
     <w:name w:val="Heading 5 Char"/>
     <w:basedOn w:val="DefaultParagraphFont"/>
     <w:link w:val="Heading5"/>
@@ -3189,7 +3197,7 @@
       <w:color w:val="0F4761" w:themeColor="accent1" w:themeShade="BF"/>
     </w:rPr>
   </w:style>
-  <w:style w:type="character" w:customStyle="1" w:styleId="Heading6Char">
+  <w:style w:type="character" w:styleId="Heading6Char" w:customStyle="1">
     <w:name w:val="Heading 6 Char"/>
     <w:basedOn w:val="DefaultParagraphFont"/>
     <w:link w:val="Heading6"/>
@@ -3203,7 +3211,7 @@
       <w:color w:val="595959" w:themeColor="text1" w:themeTint="A6"/>
     </w:rPr>
   </w:style>
-  <w:style w:type="character" w:customStyle="1" w:styleId="Heading7Char">
+  <w:style w:type="character" w:styleId="Heading7Char" w:customStyle="1">
     <w:name w:val="Heading 7 Char"/>
     <w:basedOn w:val="DefaultParagraphFont"/>
     <w:link w:val="Heading7"/>
@@ -3215,7 +3223,7 @@
       <w:color w:val="595959" w:themeColor="text1" w:themeTint="A6"/>
     </w:rPr>
   </w:style>
-  <w:style w:type="character" w:customStyle="1" w:styleId="Heading8Char">
+  <w:style w:type="character" w:styleId="Heading8Char" w:customStyle="1">
     <w:name w:val="Heading 8 Char"/>
     <w:basedOn w:val="DefaultParagraphFont"/>
     <w:link w:val="Heading8"/>
@@ -3229,7 +3237,7 @@
       <w:color w:val="272727" w:themeColor="text1" w:themeTint="D8"/>
     </w:rPr>
   </w:style>
-  <w:style w:type="character" w:customStyle="1" w:styleId="Heading9Char">
+  <w:style w:type="character" w:styleId="Heading9Char" w:customStyle="1">
     <w:name w:val="Heading 9 Char"/>
     <w:basedOn w:val="DefaultParagraphFont"/>
     <w:link w:val="Heading9"/>
@@ -3254,21 +3262,21 @@
       <w:contextualSpacing/>
     </w:pPr>
     <w:rPr>
-      <w:rFonts w:asciiTheme="majorHAnsi" w:eastAsiaTheme="majorEastAsia" w:hAnsiTheme="majorHAnsi" w:cstheme="majorBidi"/>
+      <w:rFonts w:asciiTheme="majorHAnsi" w:hAnsiTheme="majorHAnsi" w:eastAsiaTheme="majorEastAsia" w:cstheme="majorBidi"/>
       <w:spacing w:val="-10"/>
       <w:kern w:val="28"/>
       <w:sz w:val="56"/>
       <w:szCs w:val="56"/>
     </w:rPr>
   </w:style>
-  <w:style w:type="character" w:customStyle="1" w:styleId="TitleChar">
+  <w:style w:type="character" w:styleId="TitleChar" w:customStyle="1">
     <w:name w:val="Title Char"/>
     <w:basedOn w:val="DefaultParagraphFont"/>
     <w:link w:val="Title"/>
     <w:uiPriority w:val="10"/>
     <w:rsid w:val="00246733"/>
     <w:rPr>
-      <w:rFonts w:asciiTheme="majorHAnsi" w:eastAsiaTheme="majorEastAsia" w:hAnsiTheme="majorHAnsi" w:cstheme="majorBidi"/>
+      <w:rFonts w:asciiTheme="majorHAnsi" w:hAnsiTheme="majorHAnsi" w:eastAsiaTheme="majorEastAsia" w:cstheme="majorBidi"/>
       <w:spacing w:val="-10"/>
       <w:kern w:val="28"/>
       <w:sz w:val="56"/>
@@ -3296,7 +3304,7 @@
       <w:szCs w:val="28"/>
     </w:rPr>
   </w:style>
-  <w:style w:type="character" w:customStyle="1" w:styleId="SubtitleChar">
+  <w:style w:type="character" w:styleId="SubtitleChar" w:customStyle="1">
     <w:name w:val="Subtitle Char"/>
     <w:basedOn w:val="DefaultParagraphFont"/>
     <w:link w:val="Subtitle"/>
@@ -3328,7 +3336,7 @@
       <w:color w:val="404040" w:themeColor="text1" w:themeTint="BF"/>
     </w:rPr>
   </w:style>
-  <w:style w:type="character" w:customStyle="1" w:styleId="QuoteChar">
+  <w:style w:type="character" w:styleId="QuoteChar" w:customStyle="1">
     <w:name w:val="Quote Char"/>
     <w:basedOn w:val="DefaultParagraphFont"/>
     <w:link w:val="Quote"/>
@@ -3373,8 +3381,8 @@
     <w:rsid w:val="00246733"/>
     <w:pPr>
       <w:pBdr>
-        <w:top w:val="single" w:sz="4" w:space="10" w:color="0F4761" w:themeColor="accent1" w:themeShade="BF"/>
-        <w:bottom w:val="single" w:sz="4" w:space="10" w:color="0F4761" w:themeColor="accent1" w:themeShade="BF"/>
+        <w:top w:val="single" w:color="0F4761" w:themeColor="accent1" w:themeShade="BF" w:sz="4" w:space="10"/>
+        <w:bottom w:val="single" w:color="0F4761" w:themeColor="accent1" w:themeShade="BF" w:sz="4" w:space="10"/>
       </w:pBdr>
       <w:spacing w:before="360" w:after="360"/>
       <w:ind w:left="864" w:right="864"/>
@@ -3386,7 +3394,7 @@
       <w:color w:val="0F4761" w:themeColor="accent1" w:themeShade="BF"/>
     </w:rPr>
   </w:style>
-  <w:style w:type="character" w:customStyle="1" w:styleId="IntenseQuoteChar">
+  <w:style w:type="character" w:styleId="IntenseQuoteChar" w:customStyle="1">
     <w:name w:val="Intense Quote Char"/>
     <w:basedOn w:val="DefaultParagraphFont"/>
     <w:link w:val="IntenseQuote"/>
@@ -3430,7 +3438,7 @@
       <w14:ligatures w14:val="none"/>
     </w:rPr>
   </w:style>
-  <w:style w:type="character" w:customStyle="1" w:styleId="NoSpacingChar">
+  <w:style w:type="character" w:styleId="NoSpacingChar" w:customStyle="1">
     <w:name w:val="No Spacing Char"/>
     <w:basedOn w:val="DefaultParagraphFont"/>
     <w:link w:val="NoSpacing"/>
@@ -3460,7 +3468,7 @@
       <w:spacing w:after="0" w:line="240" w:lineRule="auto"/>
     </w:pPr>
   </w:style>
-  <w:style w:type="character" w:customStyle="1" w:styleId="HeaderChar">
+  <w:style w:type="character" w:styleId="HeaderChar" w:customStyle="1">
     <w:name w:val="Header Char"/>
     <w:basedOn w:val="DefaultParagraphFont"/>
     <w:link w:val="Header"/>
@@ -3482,7 +3490,7 @@
       <w:spacing w:after="0" w:line="240" w:lineRule="auto"/>
     </w:pPr>
   </w:style>
-  <w:style w:type="character" w:customStyle="1" w:styleId="FooterChar">
+  <w:style w:type="character" w:styleId="FooterChar" w:customStyle="1">
     <w:name w:val="Footer Char"/>
     <w:basedOn w:val="DefaultParagraphFont"/>
     <w:link w:val="Footer"/>
@@ -3493,7 +3501,7 @@
 </file>
 
 <file path=word/theme/theme1.xml><?xml version="1.0" encoding="utf-8"?>
-<a:theme xmlns:a="http://schemas.openxmlformats.org/drawingml/2006/main" name="Office Theme">
+<a:theme xmlns:a="http://schemas.openxmlformats.org/drawingml/2006/main" xmlns:thm15="http://schemas.microsoft.com/office/thememl/2012/main" name="Office Theme">
   <a:themeElements>
     <a:clrScheme name="Office">
       <a:dk1>

</xml_diff>